<commit_message>
Rebrand the tenant letters, unname the facility, drop the decks
The earlier rebrand matched "Protego" and "protego" but not "PROTEGO",
which is how all eight tenant letters write it — so they were skipped
entirely, and the check that said they were clean used the same pattern
and agreed with itself. Matching is now case-insensitive: 119 further
replacements, and the verification counts case-insensitively too.

These letters are templates, so no operator is named on them any more.
"All Purpose Storage" becomes [Company Name], alongside the [Facility
Name], [Tenant Name] and [Date] placeholders already in use, and the
malformed [All Purpose Facility Name] becomes [Facility Name].

The training decks come off the portal: the videos now carry that content
start to finish, so the PowerPoints were a second copy to keep in step.

Co-Authored-By: Claude Opus 5 <noreply@anthropic.com>
Claude-Session: https://claude.ai/code/session_01SVBeaJqqY1w1riJ9JWxQJ1
</commit_message>
<xml_diff>
--- a/documents/tpp/expiration-notice.docx
+++ b/documents/tpp/expiration-notice.docx
@@ -1,27 +1,27 @@
 
 <file path=word/document.xml><?xml version="1.0" encoding="utf-8"?>
-<w:document xmlns:wpc="http://schemas.microsoft.com/office/word/2010/wordprocessingCanvas" xmlns:cx="http://schemas.microsoft.com/office/drawing/2014/chartex" xmlns:cx1="http://schemas.microsoft.com/office/drawing/2015/9/8/chartex" xmlns:cx2="http://schemas.microsoft.com/office/drawing/2015/10/21/chartex" xmlns:cx3="http://schemas.microsoft.com/office/drawing/2016/5/9/chartex" xmlns:cx4="http://schemas.microsoft.com/office/drawing/2016/5/10/chartex" xmlns:cx5="http://schemas.microsoft.com/office/drawing/2016/5/11/chartex" xmlns:cx6="http://schemas.microsoft.com/office/drawing/2016/5/12/chartex" xmlns:cx7="http://schemas.microsoft.com/office/drawing/2016/5/13/chartex" xmlns:cx8="http://schemas.microsoft.com/office/drawing/2016/5/14/chartex" xmlns:mc="http://schemas.openxmlformats.org/markup-compatibility/2006" xmlns:aink="http://schemas.microsoft.com/office/drawing/2016/ink" xmlns:am3d="http://schemas.microsoft.com/office/drawing/2017/model3d" xmlns:o="urn:schemas-microsoft-com:office:office" xmlns:oel="http://schemas.microsoft.com/office/2019/extlst" xmlns:r="http://schemas.openxmlformats.org/officeDocument/2006/relationships" xmlns:m="http://schemas.openxmlformats.org/officeDocument/2006/math" xmlns:v="urn:schemas-microsoft-com:vml" xmlns:wp14="http://schemas.microsoft.com/office/word/2010/wordprocessingDrawing" xmlns:wp="http://schemas.openxmlformats.org/drawingml/2006/wordprocessingDrawing" xmlns:w10="urn:schemas-microsoft-com:office:word" xmlns:w="http://schemas.openxmlformats.org/wordprocessingml/2006/main" xmlns:w14="http://schemas.microsoft.com/office/word/2010/wordml" xmlns:w15="http://schemas.microsoft.com/office/word/2012/wordml" xmlns:w16cex="http://schemas.microsoft.com/office/word/2018/wordml/cex" xmlns:w16cid="http://schemas.microsoft.com/office/word/2016/wordml/cid" xmlns:w16="http://schemas.microsoft.com/office/word/2018/wordml" xmlns:w16du="http://schemas.microsoft.com/office/word/2023/wordml/word16du" xmlns:w16sdtdh="http://schemas.microsoft.com/office/word/2020/wordml/sdtdatahash" xmlns:w16sdtfl="http://schemas.microsoft.com/office/word/2024/wordml/sdtformatlock" xmlns:w16se="http://schemas.microsoft.com/office/word/2015/wordml/symex" xmlns:wpg="http://schemas.microsoft.com/office/word/2010/wordprocessingGroup" xmlns:wpi="http://schemas.microsoft.com/office/word/2010/wordprocessingInk" xmlns:wne="http://schemas.microsoft.com/office/word/2006/wordml" xmlns:wps="http://schemas.microsoft.com/office/word/2010/wordprocessingShape" mc:Ignorable="w14 w15 w16se w16cid w16 w16cex w16sdtdh w16sdtfl w16du wp14">
+<w:document xmlns:ns1="http://schemas.openxmlformats.org/markup-compatibility/2006" xmlns:ns2="http://schemas.microsoft.com/office/word/2010/wordml" xmlns:ns3="urn:schemas-microsoft-com:vml" xmlns:ns4="urn:schemas-microsoft-com:office:office" xmlns:w="http://schemas.openxmlformats.org/wordprocessingml/2006/main" ns1:Ignorable="w14 w15 w16se w16cid w16 w16cex w16sdtdh w16sdtfl w16du wp14">
   <w:body>
-    <w:p>
-      <w:pPr>
-        <w:spacing w:before="100" w:beforeAutospacing="1" w:after="100" w:afterAutospacing="1"/>
-        <w:rPr>
-          <w:rFonts w:ascii="Times New Roman" w:eastAsia="Times New Roman" w:hAnsi="Times New Roman" w:cs="Times New Roman"/>
-          <w:kern w:val="0"/>
-          <w:sz w:val="24"/>
-          <w:szCs w:val="24"/>
-          <w14:ligatures w14:val="none"/>
-        </w:rPr>
-      </w:pPr>
-      <w:r>
-        <w:rPr>
-          <w:rFonts w:ascii="Times New Roman" w:eastAsia="Times New Roman" w:hAnsi="Times New Roman" w:cs="Times New Roman"/>
-          <w:b/>
-          <w:bCs/>
-          <w:kern w:val="0"/>
-          <w:sz w:val="24"/>
-          <w:szCs w:val="24"/>
-          <w14:ligatures w14:val="none"/>
+    <w:p ns2:paraId="4B6139E9" ns2:textId="77777777">
+      <w:pPr>
+        <w:spacing w:before="100" w:beforeAutospacing="1" w:after="100" w:afterAutospacing="1"/>
+        <w:rPr>
+          <w:rFonts w:ascii="Times New Roman" w:eastAsia="Times New Roman" w:hAnsi="Times New Roman" w:cs="Times New Roman"/>
+          <w:kern w:val="0"/>
+          <w:sz w:val="24"/>
+          <w:szCs w:val="24"/>
+          <ns2:ligatures ns2:val="none"/>
+        </w:rPr>
+      </w:pPr>
+      <w:r>
+        <w:rPr>
+          <w:rFonts w:ascii="Times New Roman" w:eastAsia="Times New Roman" w:hAnsi="Times New Roman" w:cs="Times New Roman"/>
+          <w:b/>
+          <w:bCs/>
+          <w:kern w:val="0"/>
+          <w:sz w:val="24"/>
+          <w:szCs w:val="24"/>
+          <ns2:ligatures ns2:val="none"/>
         </w:rPr>
         <w:t>Subject:</w:t>
       </w:r>
@@ -31,98 +31,98 @@
           <w:kern w:val="0"/>
           <w:sz w:val="24"/>
           <w:szCs w:val="24"/>
-          <w14:ligatures w14:val="none"/>
+          <ns2:ligatures ns2:val="none"/>
         </w:rPr>
         <w:t xml:space="preserve"> Better Storage Protection Available – Your Current Insurance Expires Soon</w:t>
       </w:r>
     </w:p>
-    <w:p>
-      <w:pPr>
-        <w:rPr>
-          <w:rFonts w:ascii="Times New Roman" w:eastAsia="Times New Roman" w:hAnsi="Times New Roman" w:cs="Times New Roman"/>
-          <w:kern w:val="0"/>
-          <w:sz w:val="24"/>
-          <w:szCs w:val="24"/>
-          <w14:ligatures w14:val="none"/>
-        </w:rPr>
-      </w:pPr>
-      <w:r>
-        <w:rPr>
-          <w:rFonts w:ascii="Times New Roman" w:eastAsia="Times New Roman" w:hAnsi="Times New Roman" w:cs="Times New Roman"/>
-          <w:kern w:val="0"/>
-          <w:sz w:val="24"/>
-          <w:szCs w:val="24"/>
-          <w14:ligatures w14:val="none"/>
-        </w:rPr>
-        <w:pict w14:anchorId="12181A05">
-          <v:rect id="_x0000_i1025" style="width:0;height:1.5pt" o:hralign="center" o:hrstd="t" o:hr="t" fillcolor="#a0a0a0" stroked="f"/>
+    <w:p ns2:paraId="6BF78B2A" ns2:textId="77777777">
+      <w:pPr>
+        <w:rPr>
+          <w:rFonts w:ascii="Times New Roman" w:eastAsia="Times New Roman" w:hAnsi="Times New Roman" w:cs="Times New Roman"/>
+          <w:kern w:val="0"/>
+          <w:sz w:val="24"/>
+          <w:szCs w:val="24"/>
+          <ns2:ligatures ns2:val="none"/>
+        </w:rPr>
+      </w:pPr>
+      <w:r>
+        <w:rPr>
+          <w:rFonts w:ascii="Times New Roman" w:eastAsia="Times New Roman" w:hAnsi="Times New Roman" w:cs="Times New Roman"/>
+          <w:kern w:val="0"/>
+          <w:sz w:val="24"/>
+          <w:szCs w:val="24"/>
+          <ns2:ligatures ns2:val="none"/>
+        </w:rPr>
+        <w:pict ns2:anchorId="12181A05">
+          <ns3:rect id="_x0000_i1025" style="width:0;height:1.5pt" ns4:hralign="center" ns4:hrstd="t" ns4:hr="t" fillcolor="#a0a0a0" stroked="f"/>
         </w:pict>
       </w:r>
     </w:p>
-    <w:p>
-      <w:pPr>
-        <w:spacing w:before="100" w:beforeAutospacing="1" w:after="100" w:afterAutospacing="1"/>
-        <w:rPr>
-          <w:rFonts w:ascii="Times New Roman" w:eastAsia="Times New Roman" w:hAnsi="Times New Roman" w:cs="Times New Roman"/>
-          <w:kern w:val="0"/>
-          <w:sz w:val="24"/>
-          <w:szCs w:val="24"/>
-          <w14:ligatures w14:val="none"/>
-        </w:rPr>
-      </w:pPr>
-      <w:r>
-        <w:rPr>
-          <w:rFonts w:ascii="Times New Roman" w:eastAsia="Times New Roman" w:hAnsi="Times New Roman" w:cs="Times New Roman"/>
-          <w:kern w:val="0"/>
-          <w:sz w:val="24"/>
-          <w:szCs w:val="24"/>
-          <w14:ligatures w14:val="none"/>
+    <w:p ns2:paraId="12A2BD33" ns2:textId="77777777">
+      <w:pPr>
+        <w:spacing w:before="100" w:beforeAutospacing="1" w:after="100" w:afterAutospacing="1"/>
+        <w:rPr>
+          <w:rFonts w:ascii="Times New Roman" w:eastAsia="Times New Roman" w:hAnsi="Times New Roman" w:cs="Times New Roman"/>
+          <w:kern w:val="0"/>
+          <w:sz w:val="24"/>
+          <w:szCs w:val="24"/>
+          <ns2:ligatures ns2:val="none"/>
+        </w:rPr>
+      </w:pPr>
+      <w:r>
+        <w:rPr>
+          <w:rFonts w:ascii="Times New Roman" w:eastAsia="Times New Roman" w:hAnsi="Times New Roman" w:cs="Times New Roman"/>
+          <w:kern w:val="0"/>
+          <w:sz w:val="24"/>
+          <w:szCs w:val="24"/>
+          <ns2:ligatures ns2:val="none"/>
         </w:rPr>
         <w:t>Dear [Tenant FirstName],</w:t>
       </w:r>
     </w:p>
-    <w:p>
-      <w:pPr>
-        <w:spacing w:before="100" w:beforeAutospacing="1" w:after="100" w:afterAutospacing="1"/>
-        <w:rPr>
-          <w:rFonts w:ascii="Times New Roman" w:eastAsia="Times New Roman" w:hAnsi="Times New Roman" w:cs="Times New Roman"/>
-          <w:kern w:val="0"/>
-          <w:sz w:val="24"/>
-          <w:szCs w:val="24"/>
-          <w14:ligatures w14:val="none"/>
-        </w:rPr>
-      </w:pPr>
-      <w:r>
-        <w:rPr>
-          <w:rFonts w:ascii="Times New Roman" w:eastAsia="Times New Roman" w:hAnsi="Times New Roman" w:cs="Times New Roman"/>
-          <w:b/>
-          <w:bCs/>
-          <w:kern w:val="0"/>
-          <w:sz w:val="24"/>
-          <w:szCs w:val="24"/>
-          <w14:ligatures w14:val="none"/>
+    <w:p ns2:paraId="08411995" ns2:textId="77777777">
+      <w:pPr>
+        <w:spacing w:before="100" w:beforeAutospacing="1" w:after="100" w:afterAutospacing="1"/>
+        <w:rPr>
+          <w:rFonts w:ascii="Times New Roman" w:eastAsia="Times New Roman" w:hAnsi="Times New Roman" w:cs="Times New Roman"/>
+          <w:kern w:val="0"/>
+          <w:sz w:val="24"/>
+          <w:szCs w:val="24"/>
+          <ns2:ligatures ns2:val="none"/>
+        </w:rPr>
+      </w:pPr>
+      <w:r>
+        <w:rPr>
+          <w:rFonts w:ascii="Times New Roman" w:eastAsia="Times New Roman" w:hAnsi="Times New Roman" w:cs="Times New Roman"/>
+          <w:b/>
+          <w:bCs/>
+          <w:kern w:val="0"/>
+          <w:sz w:val="24"/>
+          <w:szCs w:val="24"/>
+          <ns2:ligatures ns2:val="none"/>
         </w:rPr>
         <w:t>There's a Smarter Way to Protect Your Stored Belongings</w:t>
       </w:r>
     </w:p>
-    <w:p>
-      <w:pPr>
-        <w:spacing w:before="100" w:beforeAutospacing="1" w:after="100" w:afterAutospacing="1"/>
-        <w:rPr>
-          <w:rFonts w:ascii="Times New Roman" w:eastAsia="Times New Roman" w:hAnsi="Times New Roman" w:cs="Times New Roman"/>
-          <w:kern w:val="0"/>
-          <w:sz w:val="24"/>
-          <w:szCs w:val="24"/>
-          <w14:ligatures w14:val="none"/>
-        </w:rPr>
-      </w:pPr>
-      <w:r>
-        <w:rPr>
-          <w:rFonts w:ascii="Times New Roman" w:eastAsia="Times New Roman" w:hAnsi="Times New Roman" w:cs="Times New Roman"/>
-          <w:kern w:val="0"/>
-          <w:sz w:val="24"/>
-          <w:szCs w:val="24"/>
-          <w14:ligatures w14:val="none"/>
+    <w:p ns2:paraId="447F2A9E" ns2:textId="1E05A094">
+      <w:pPr>
+        <w:spacing w:before="100" w:beforeAutospacing="1" w:after="100" w:afterAutospacing="1"/>
+        <w:rPr>
+          <w:rFonts w:ascii="Times New Roman" w:eastAsia="Times New Roman" w:hAnsi="Times New Roman" w:cs="Times New Roman"/>
+          <w:kern w:val="0"/>
+          <w:sz w:val="24"/>
+          <w:szCs w:val="24"/>
+          <ns2:ligatures ns2:val="none"/>
+        </w:rPr>
+      </w:pPr>
+      <w:r>
+        <w:rPr>
+          <w:rFonts w:ascii="Times New Roman" w:eastAsia="Times New Roman" w:hAnsi="Times New Roman" w:cs="Times New Roman"/>
+          <w:kern w:val="0"/>
+          <w:sz w:val="24"/>
+          <w:szCs w:val="24"/>
+          <ns2:ligatures ns2:val="none"/>
         </w:rPr>
         <w:t xml:space="preserve">We're reaching out because your insurance declaration page expires in </w:t>
       </w:r>
@@ -134,7 +134,7 @@
           <w:kern w:val="0"/>
           <w:sz w:val="24"/>
           <w:szCs w:val="24"/>
-          <w14:ligatures w14:val="none"/>
+          <ns2:ligatures ns2:val="none"/>
         </w:rPr>
         <w:t>10 days</w:t>
       </w:r>
@@ -144,7 +144,7 @@
           <w:kern w:val="0"/>
           <w:sz w:val="24"/>
           <w:szCs w:val="24"/>
-          <w14:ligatures w14:val="none"/>
+          <ns2:ligatures ns2:val="none"/>
         </w:rPr>
         <w:t xml:space="preserve">—and this might be the perfect time to discover why so many [Facility Name] tenants are switching to </w:t>
       </w:r>
@@ -156,51 +156,51 @@
           <w:kern w:val="0"/>
           <w:sz w:val="24"/>
           <w:szCs w:val="24"/>
-          <w14:ligatures w14:val="none"/>
-        </w:rPr>
-        <w:t>PROTEGO</w:t>
-      </w:r>
-      <w:r>
-        <w:rPr>
-          <w:rFonts w:ascii="Times New Roman" w:eastAsia="Times New Roman" w:hAnsi="Times New Roman" w:cs="Times New Roman"/>
-          <w:b/>
-          <w:bCs/>
-          <w:kern w:val="0"/>
-          <w:sz w:val="24"/>
-          <w:szCs w:val="24"/>
-          <w14:ligatures w14:val="none"/>
-        </w:rPr>
-        <w:t xml:space="preserve"> Protection</w:t>
-      </w:r>
-      <w:r>
-        <w:rPr>
-          <w:rFonts w:ascii="Times New Roman" w:eastAsia="Times New Roman" w:hAnsi="Times New Roman" w:cs="Times New Roman"/>
-          <w:kern w:val="0"/>
-          <w:sz w:val="24"/>
-          <w:szCs w:val="24"/>
-          <w14:ligatures w14:val="none"/>
+          <ns2:ligatures ns2:val="none"/>
+        </w:rPr>
+        <w:t>TPP Secure Protection</w:t>
+      </w:r>
+      <w:r>
+        <w:rPr>
+          <w:rFonts w:ascii="Times New Roman" w:eastAsia="Times New Roman" w:hAnsi="Times New Roman" w:cs="Times New Roman"/>
+          <w:b/>
+          <w:bCs/>
+          <w:kern w:val="0"/>
+          <w:sz w:val="24"/>
+          <w:szCs w:val="24"/>
+          <ns2:ligatures ns2:val="none"/>
+        </w:rPr>
+        <w:t xml:space="preserve"/>
+      </w:r>
+      <w:r>
+        <w:rPr>
+          <w:rFonts w:ascii="Times New Roman" w:eastAsia="Times New Roman" w:hAnsi="Times New Roman" w:cs="Times New Roman"/>
+          <w:kern w:val="0"/>
+          <w:sz w:val="24"/>
+          <w:szCs w:val="24"/>
+          <ns2:ligatures ns2:val="none"/>
         </w:rPr>
         <w:t>.</w:t>
       </w:r>
     </w:p>
-    <w:p>
-      <w:pPr>
-        <w:spacing w:before="100" w:beforeAutospacing="1" w:after="100" w:afterAutospacing="1"/>
-        <w:rPr>
-          <w:rFonts w:ascii="Times New Roman" w:eastAsia="Times New Roman" w:hAnsi="Times New Roman" w:cs="Times New Roman"/>
-          <w:kern w:val="0"/>
-          <w:sz w:val="24"/>
-          <w:szCs w:val="24"/>
-          <w14:ligatures w14:val="none"/>
-        </w:rPr>
-      </w:pPr>
-      <w:r>
-        <w:rPr>
-          <w:rFonts w:ascii="Times New Roman" w:eastAsia="Times New Roman" w:hAnsi="Times New Roman" w:cs="Times New Roman"/>
-          <w:kern w:val="0"/>
-          <w:sz w:val="24"/>
-          <w:szCs w:val="24"/>
-          <w14:ligatures w14:val="none"/>
+    <w:p ns2:paraId="5D92BFCC" ns2:textId="77777777">
+      <w:pPr>
+        <w:spacing w:before="100" w:beforeAutospacing="1" w:after="100" w:afterAutospacing="1"/>
+        <w:rPr>
+          <w:rFonts w:ascii="Times New Roman" w:eastAsia="Times New Roman" w:hAnsi="Times New Roman" w:cs="Times New Roman"/>
+          <w:kern w:val="0"/>
+          <w:sz w:val="24"/>
+          <w:szCs w:val="24"/>
+          <ns2:ligatures ns2:val="none"/>
+        </w:rPr>
+      </w:pPr>
+      <w:r>
+        <w:rPr>
+          <w:rFonts w:ascii="Times New Roman" w:eastAsia="Times New Roman" w:hAnsi="Times New Roman" w:cs="Times New Roman"/>
+          <w:kern w:val="0"/>
+          <w:sz w:val="24"/>
+          <w:szCs w:val="24"/>
+          <ns2:ligatures ns2:val="none"/>
         </w:rPr>
         <w:t xml:space="preserve">If you've been dealing with high insurance deductibles, premium increases after claims, or uncertainty about whether your homeowner's policy </w:t>
       </w:r>
@@ -211,7 +211,7 @@
           <w:kern w:val="0"/>
           <w:sz w:val="24"/>
           <w:szCs w:val="24"/>
-          <w14:ligatures w14:val="none"/>
+          <ns2:ligatures ns2:val="none"/>
         </w:rPr>
         <w:t>actually covers</w:t>
       </w:r>
@@ -222,54 +222,54 @@
           <w:kern w:val="0"/>
           <w:sz w:val="24"/>
           <w:szCs w:val="24"/>
-          <w14:ligatures w14:val="none"/>
+          <ns2:ligatures ns2:val="none"/>
         </w:rPr>
         <w:t xml:space="preserve"> storage, there's a better solution designed specifically for you.</w:t>
       </w:r>
     </w:p>
-    <w:p>
-      <w:pPr>
-        <w:rPr>
-          <w:rFonts w:ascii="Times New Roman" w:eastAsia="Times New Roman" w:hAnsi="Times New Roman" w:cs="Times New Roman"/>
-          <w:kern w:val="0"/>
-          <w:sz w:val="24"/>
-          <w:szCs w:val="24"/>
-          <w14:ligatures w14:val="none"/>
-        </w:rPr>
-      </w:pPr>
-      <w:r>
-        <w:rPr>
-          <w:rFonts w:ascii="Times New Roman" w:eastAsia="Times New Roman" w:hAnsi="Times New Roman" w:cs="Times New Roman"/>
-          <w:kern w:val="0"/>
-          <w:sz w:val="24"/>
-          <w:szCs w:val="24"/>
-          <w14:ligatures w14:val="none"/>
-        </w:rPr>
-        <w:pict w14:anchorId="41AADCE7">
-          <v:rect id="_x0000_i1026" style="width:0;height:1.5pt" o:hralign="center" o:hrstd="t" o:hr="t" fillcolor="#a0a0a0" stroked="f"/>
+    <w:p ns2:paraId="61D4CB20" ns2:textId="77777777">
+      <w:pPr>
+        <w:rPr>
+          <w:rFonts w:ascii="Times New Roman" w:eastAsia="Times New Roman" w:hAnsi="Times New Roman" w:cs="Times New Roman"/>
+          <w:kern w:val="0"/>
+          <w:sz w:val="24"/>
+          <w:szCs w:val="24"/>
+          <ns2:ligatures ns2:val="none"/>
+        </w:rPr>
+      </w:pPr>
+      <w:r>
+        <w:rPr>
+          <w:rFonts w:ascii="Times New Roman" w:eastAsia="Times New Roman" w:hAnsi="Times New Roman" w:cs="Times New Roman"/>
+          <w:kern w:val="0"/>
+          <w:sz w:val="24"/>
+          <w:szCs w:val="24"/>
+          <ns2:ligatures ns2:val="none"/>
+        </w:rPr>
+        <w:pict ns2:anchorId="41AADCE7">
+          <ns3:rect id="_x0000_i1026" style="width:0;height:1.5pt" ns4:hralign="center" ns4:hrstd="t" ns4:hr="t" fillcolor="#a0a0a0" stroked="f"/>
         </w:pict>
       </w:r>
     </w:p>
-    <w:p>
-      <w:pPr>
-        <w:spacing w:before="100" w:beforeAutospacing="1" w:after="100" w:afterAutospacing="1"/>
-        <w:rPr>
-          <w:rFonts w:ascii="Times New Roman" w:eastAsia="Times New Roman" w:hAnsi="Times New Roman" w:cs="Times New Roman"/>
-          <w:kern w:val="0"/>
-          <w:sz w:val="24"/>
-          <w:szCs w:val="24"/>
-          <w14:ligatures w14:val="none"/>
-        </w:rPr>
-      </w:pPr>
-      <w:r>
-        <w:rPr>
-          <w:rFonts w:ascii="Times New Roman" w:eastAsia="Times New Roman" w:hAnsi="Times New Roman" w:cs="Times New Roman"/>
-          <w:b/>
-          <w:bCs/>
-          <w:kern w:val="0"/>
-          <w:sz w:val="24"/>
-          <w:szCs w:val="24"/>
-          <w14:ligatures w14:val="none"/>
+    <w:p ns2:paraId="3B81788C" ns2:textId="3E61D14F">
+      <w:pPr>
+        <w:spacing w:before="100" w:beforeAutospacing="1" w:after="100" w:afterAutospacing="1"/>
+        <w:rPr>
+          <w:rFonts w:ascii="Times New Roman" w:eastAsia="Times New Roman" w:hAnsi="Times New Roman" w:cs="Times New Roman"/>
+          <w:kern w:val="0"/>
+          <w:sz w:val="24"/>
+          <w:szCs w:val="24"/>
+          <ns2:ligatures ns2:val="none"/>
+        </w:rPr>
+      </w:pPr>
+      <w:r>
+        <w:rPr>
+          <w:rFonts w:ascii="Times New Roman" w:eastAsia="Times New Roman" w:hAnsi="Times New Roman" w:cs="Times New Roman"/>
+          <w:b/>
+          <w:bCs/>
+          <w:kern w:val="0"/>
+          <w:sz w:val="24"/>
+          <w:szCs w:val="24"/>
+          <ns2:ligatures ns2:val="none"/>
         </w:rPr>
         <w:t xml:space="preserve">Why Tenants Are Choosing </w:t>
       </w:r>
@@ -281,65 +281,65 @@
           <w:kern w:val="0"/>
           <w:sz w:val="24"/>
           <w:szCs w:val="24"/>
-          <w14:ligatures w14:val="none"/>
-        </w:rPr>
-        <w:t>PROTEGO</w:t>
-      </w:r>
-      <w:r>
-        <w:rPr>
-          <w:rFonts w:ascii="Times New Roman" w:eastAsia="Times New Roman" w:hAnsi="Times New Roman" w:cs="Times New Roman"/>
-          <w:b/>
-          <w:bCs/>
-          <w:kern w:val="0"/>
-          <w:sz w:val="24"/>
-          <w:szCs w:val="24"/>
-          <w14:ligatures w14:val="none"/>
-        </w:rPr>
-        <w:t xml:space="preserve"> Protection</w:t>
-      </w:r>
-    </w:p>
-    <w:p>
-      <w:pPr>
-        <w:spacing w:before="100" w:beforeAutospacing="1" w:after="100" w:afterAutospacing="1"/>
-        <w:rPr>
-          <w:rFonts w:ascii="Times New Roman" w:eastAsia="Times New Roman" w:hAnsi="Times New Roman" w:cs="Times New Roman"/>
-          <w:kern w:val="0"/>
-          <w:sz w:val="24"/>
-          <w:szCs w:val="24"/>
-          <w14:ligatures w14:val="none"/>
-        </w:rPr>
-      </w:pPr>
-      <w:r>
-        <w:rPr>
-          <w:rFonts w:ascii="Times New Roman" w:eastAsia="Times New Roman" w:hAnsi="Times New Roman" w:cs="Times New Roman"/>
-          <w:b/>
-          <w:bCs/>
-          <w:kern w:val="0"/>
-          <w:sz w:val="24"/>
-          <w:szCs w:val="24"/>
-          <w14:ligatures w14:val="none"/>
+          <ns2:ligatures ns2:val="none"/>
+        </w:rPr>
+        <w:t>TPP Secure Protection</w:t>
+      </w:r>
+      <w:r>
+        <w:rPr>
+          <w:rFonts w:ascii="Times New Roman" w:eastAsia="Times New Roman" w:hAnsi="Times New Roman" w:cs="Times New Roman"/>
+          <w:b/>
+          <w:bCs/>
+          <w:kern w:val="0"/>
+          <w:sz w:val="24"/>
+          <w:szCs w:val="24"/>
+          <ns2:ligatures ns2:val="none"/>
+        </w:rPr>
+        <w:t xml:space="preserve"/>
+      </w:r>
+    </w:p>
+    <w:p ns2:paraId="70FA583E" ns2:textId="77777777">
+      <w:pPr>
+        <w:spacing w:before="100" w:beforeAutospacing="1" w:after="100" w:afterAutospacing="1"/>
+        <w:rPr>
+          <w:rFonts w:ascii="Times New Roman" w:eastAsia="Times New Roman" w:hAnsi="Times New Roman" w:cs="Times New Roman"/>
+          <w:kern w:val="0"/>
+          <w:sz w:val="24"/>
+          <w:szCs w:val="24"/>
+          <ns2:ligatures ns2:val="none"/>
+        </w:rPr>
+      </w:pPr>
+      <w:r>
+        <w:rPr>
+          <w:rFonts w:ascii="Times New Roman" w:eastAsia="Times New Roman" w:hAnsi="Times New Roman" w:cs="Times New Roman"/>
+          <w:b/>
+          <w:bCs/>
+          <w:kern w:val="0"/>
+          <w:sz w:val="24"/>
+          <w:szCs w:val="24"/>
+          <ns2:ligatures ns2:val="none"/>
         </w:rPr>
         <w:t>1. Costs Less Than Most Insurance Deductibles</w:t>
       </w:r>
     </w:p>
-    <w:p>
-      <w:pPr>
-        <w:spacing w:before="100" w:beforeAutospacing="1" w:after="100" w:afterAutospacing="1"/>
-        <w:rPr>
-          <w:rFonts w:ascii="Times New Roman" w:eastAsia="Times New Roman" w:hAnsi="Times New Roman" w:cs="Times New Roman"/>
-          <w:kern w:val="0"/>
-          <w:sz w:val="24"/>
-          <w:szCs w:val="24"/>
-          <w14:ligatures w14:val="none"/>
-        </w:rPr>
-      </w:pPr>
-      <w:r>
-        <w:rPr>
-          <w:rFonts w:ascii="Times New Roman" w:eastAsia="Times New Roman" w:hAnsi="Times New Roman" w:cs="Times New Roman"/>
-          <w:kern w:val="0"/>
-          <w:sz w:val="24"/>
-          <w:szCs w:val="24"/>
-          <w14:ligatures w14:val="none"/>
+    <w:p ns2:paraId="4F182401" ns2:textId="511E94B2">
+      <w:pPr>
+        <w:spacing w:before="100" w:beforeAutospacing="1" w:after="100" w:afterAutospacing="1"/>
+        <w:rPr>
+          <w:rFonts w:ascii="Times New Roman" w:eastAsia="Times New Roman" w:hAnsi="Times New Roman" w:cs="Times New Roman"/>
+          <w:kern w:val="0"/>
+          <w:sz w:val="24"/>
+          <w:szCs w:val="24"/>
+          <ns2:ligatures ns2:val="none"/>
+        </w:rPr>
+      </w:pPr>
+      <w:r>
+        <w:rPr>
+          <w:rFonts w:ascii="Times New Roman" w:eastAsia="Times New Roman" w:hAnsi="Times New Roman" w:cs="Times New Roman"/>
+          <w:kern w:val="0"/>
+          <w:sz w:val="24"/>
+          <w:szCs w:val="24"/>
+          <ns2:ligatures ns2:val="none"/>
         </w:rPr>
         <w:t xml:space="preserve">At just </w:t>
       </w:r>
@@ -351,7 +351,7 @@
           <w:kern w:val="0"/>
           <w:sz w:val="24"/>
           <w:szCs w:val="24"/>
-          <w14:ligatures w14:val="none"/>
+          <ns2:ligatures ns2:val="none"/>
         </w:rPr>
         <w:t>$12/month</w:t>
       </w:r>
@@ -361,7 +361,7 @@
           <w:kern w:val="0"/>
           <w:sz w:val="24"/>
           <w:szCs w:val="24"/>
-          <w14:ligatures w14:val="none"/>
+          <ns2:ligatures ns2:val="none"/>
         </w:rPr>
         <w:t xml:space="preserve"> ($0.40 per day), </w:t>
       </w:r>
@@ -371,19 +371,19 @@
           <w:kern w:val="0"/>
           <w:sz w:val="24"/>
           <w:szCs w:val="24"/>
-          <w14:ligatures w14:val="none"/>
-        </w:rPr>
-        <w:t>PROTEGO</w:t>
-      </w:r>
-      <w:r>
-        <w:rPr>
-          <w:rFonts w:ascii="Times New Roman" w:eastAsia="Times New Roman" w:hAnsi="Times New Roman" w:cs="Times New Roman"/>
-          <w:kern w:val="0"/>
-          <w:sz w:val="24"/>
-          <w:szCs w:val="24"/>
-          <w14:ligatures w14:val="none"/>
-        </w:rPr>
-        <w:t xml:space="preserve"> Protection costs less than </w:t>
+          <ns2:ligatures ns2:val="none"/>
+        </w:rPr>
+        <w:t>TPP Secure Protection</w:t>
+      </w:r>
+      <w:r>
+        <w:rPr>
+          <w:rFonts w:ascii="Times New Roman" w:eastAsia="Times New Roman" w:hAnsi="Times New Roman" w:cs="Times New Roman"/>
+          <w:kern w:val="0"/>
+          <w:sz w:val="24"/>
+          <w:szCs w:val="24"/>
+          <ns2:ligatures ns2:val="none"/>
+        </w:rPr>
+        <w:t xml:space="preserve"> costs less than </w:t>
       </w:r>
       <w:proofErr w:type="gramStart"/>
       <w:r>
@@ -392,7 +392,7 @@
           <w:kern w:val="0"/>
           <w:sz w:val="24"/>
           <w:szCs w:val="24"/>
-          <w14:ligatures w14:val="none"/>
+          <ns2:ligatures ns2:val="none"/>
         </w:rPr>
         <w:t>a typical</w:t>
       </w:r>
@@ -403,7 +403,7 @@
           <w:kern w:val="0"/>
           <w:sz w:val="24"/>
           <w:szCs w:val="24"/>
-          <w14:ligatures w14:val="none"/>
+          <ns2:ligatures ns2:val="none"/>
         </w:rPr>
         <w:t xml:space="preserve"> $500-$1,000 insurance deductible. And unlike traditional insurance, </w:t>
       </w:r>
@@ -413,17 +413,17 @@
           <w:kern w:val="0"/>
           <w:sz w:val="24"/>
           <w:szCs w:val="24"/>
-          <w14:ligatures w14:val="none"/>
-        </w:rPr>
-        <w:t>PROTEGO</w:t>
-      </w:r>
-      <w:r>
-        <w:rPr>
-          <w:rFonts w:ascii="Times New Roman" w:eastAsia="Times New Roman" w:hAnsi="Times New Roman" w:cs="Times New Roman"/>
-          <w:kern w:val="0"/>
-          <w:sz w:val="24"/>
-          <w:szCs w:val="24"/>
-          <w14:ligatures w14:val="none"/>
+          <ns2:ligatures ns2:val="none"/>
+        </w:rPr>
+        <w:t>TPP Secure</w:t>
+      </w:r>
+      <w:r>
+        <w:rPr>
+          <w:rFonts w:ascii="Times New Roman" w:eastAsia="Times New Roman" w:hAnsi="Times New Roman" w:cs="Times New Roman"/>
+          <w:kern w:val="0"/>
+          <w:sz w:val="24"/>
+          <w:szCs w:val="24"/>
+          <ns2:ligatures ns2:val="none"/>
         </w:rPr>
         <w:t xml:space="preserve"> has </w:t>
       </w:r>
@@ -435,7 +435,7 @@
           <w:kern w:val="0"/>
           <w:sz w:val="24"/>
           <w:szCs w:val="24"/>
-          <w14:ligatures w14:val="none"/>
+          <ns2:ligatures ns2:val="none"/>
         </w:rPr>
         <w:t>zero deductible</w:t>
       </w:r>
@@ -445,75 +445,75 @@
           <w:kern w:val="0"/>
           <w:sz w:val="24"/>
           <w:szCs w:val="24"/>
-          <w14:ligatures w14:val="none"/>
+          <ns2:ligatures ns2:val="none"/>
         </w:rPr>
         <w:t>—coverage starts from dollar one when you need it.</w:t>
       </w:r>
     </w:p>
-    <w:p>
-      <w:pPr>
-        <w:spacing w:before="100" w:beforeAutospacing="1" w:after="100" w:afterAutospacing="1"/>
-        <w:rPr>
-          <w:rFonts w:ascii="Times New Roman" w:eastAsia="Times New Roman" w:hAnsi="Times New Roman" w:cs="Times New Roman"/>
-          <w:kern w:val="0"/>
-          <w:sz w:val="24"/>
-          <w:szCs w:val="24"/>
-          <w14:ligatures w14:val="none"/>
-        </w:rPr>
-      </w:pPr>
-      <w:r>
-        <w:rPr>
-          <w:rFonts w:ascii="Times New Roman" w:eastAsia="Times New Roman" w:hAnsi="Times New Roman" w:cs="Times New Roman"/>
-          <w:b/>
-          <w:bCs/>
-          <w:kern w:val="0"/>
-          <w:sz w:val="24"/>
-          <w:szCs w:val="24"/>
-          <w14:ligatures w14:val="none"/>
+    <w:p ns2:paraId="6C2A2057" ns2:textId="77777777">
+      <w:pPr>
+        <w:spacing w:before="100" w:beforeAutospacing="1" w:after="100" w:afterAutospacing="1"/>
+        <w:rPr>
+          <w:rFonts w:ascii="Times New Roman" w:eastAsia="Times New Roman" w:hAnsi="Times New Roman" w:cs="Times New Roman"/>
+          <w:kern w:val="0"/>
+          <w:sz w:val="24"/>
+          <w:szCs w:val="24"/>
+          <ns2:ligatures ns2:val="none"/>
+        </w:rPr>
+      </w:pPr>
+      <w:r>
+        <w:rPr>
+          <w:rFonts w:ascii="Times New Roman" w:eastAsia="Times New Roman" w:hAnsi="Times New Roman" w:cs="Times New Roman"/>
+          <w:b/>
+          <w:bCs/>
+          <w:kern w:val="0"/>
+          <w:sz w:val="24"/>
+          <w:szCs w:val="24"/>
+          <ns2:ligatures ns2:val="none"/>
         </w:rPr>
         <w:t>2. Protects Your Personal Insurance from Premium Hikes</w:t>
       </w:r>
     </w:p>
-    <w:p>
-      <w:pPr>
-        <w:spacing w:before="100" w:beforeAutospacing="1" w:after="100" w:afterAutospacing="1"/>
-        <w:rPr>
-          <w:rFonts w:ascii="Times New Roman" w:eastAsia="Times New Roman" w:hAnsi="Times New Roman" w:cs="Times New Roman"/>
-          <w:kern w:val="0"/>
-          <w:sz w:val="24"/>
-          <w:szCs w:val="24"/>
-          <w14:ligatures w14:val="none"/>
-        </w:rPr>
-      </w:pPr>
-      <w:r>
-        <w:rPr>
-          <w:rFonts w:ascii="Times New Roman" w:eastAsia="Times New Roman" w:hAnsi="Times New Roman" w:cs="Times New Roman"/>
-          <w:kern w:val="0"/>
-          <w:sz w:val="24"/>
-          <w:szCs w:val="24"/>
-          <w14:ligatures w14:val="none"/>
+    <w:p ns2:paraId="27278B9D" ns2:textId="77777777">
+      <w:pPr>
+        <w:spacing w:before="100" w:beforeAutospacing="1" w:after="100" w:afterAutospacing="1"/>
+        <w:rPr>
+          <w:rFonts w:ascii="Times New Roman" w:eastAsia="Times New Roman" w:hAnsi="Times New Roman" w:cs="Times New Roman"/>
+          <w:kern w:val="0"/>
+          <w:sz w:val="24"/>
+          <w:szCs w:val="24"/>
+          <ns2:ligatures ns2:val="none"/>
+        </w:rPr>
+      </w:pPr>
+      <w:r>
+        <w:rPr>
+          <w:rFonts w:ascii="Times New Roman" w:eastAsia="Times New Roman" w:hAnsi="Times New Roman" w:cs="Times New Roman"/>
+          <w:kern w:val="0"/>
+          <w:sz w:val="24"/>
+          <w:szCs w:val="24"/>
+          <ns2:ligatures ns2:val="none"/>
         </w:rPr>
         <w:t>Here's what most tenants don't realize: filing even a minor claim with your homeowner's or renter's insurance can trigger premium increases that cost you hundreds of dollars per year for the next 3-5 years.</w:t>
       </w:r>
     </w:p>
-    <w:p>
-      <w:pPr>
-        <w:spacing w:before="100" w:beforeAutospacing="1" w:after="100" w:afterAutospacing="1"/>
-        <w:rPr>
-          <w:rFonts w:ascii="Times New Roman" w:eastAsia="Times New Roman" w:hAnsi="Times New Roman" w:cs="Times New Roman"/>
-          <w:kern w:val="0"/>
-          <w:sz w:val="24"/>
-          <w:szCs w:val="24"/>
-          <w14:ligatures w14:val="none"/>
-        </w:rPr>
-      </w:pPr>
-      <w:r>
-        <w:rPr>
-          <w:rFonts w:ascii="Times New Roman" w:eastAsia="Times New Roman" w:hAnsi="Times New Roman" w:cs="Times New Roman"/>
-          <w:kern w:val="0"/>
-          <w:sz w:val="24"/>
-          <w:szCs w:val="24"/>
-          <w14:ligatures w14:val="none"/>
+    <w:p ns2:paraId="3323CFFE" ns2:textId="07949DCE">
+      <w:pPr>
+        <w:spacing w:before="100" w:beforeAutospacing="1" w:after="100" w:afterAutospacing="1"/>
+        <w:rPr>
+          <w:rFonts w:ascii="Times New Roman" w:eastAsia="Times New Roman" w:hAnsi="Times New Roman" w:cs="Times New Roman"/>
+          <w:kern w:val="0"/>
+          <w:sz w:val="24"/>
+          <w:szCs w:val="24"/>
+          <ns2:ligatures ns2:val="none"/>
+        </w:rPr>
+      </w:pPr>
+      <w:r>
+        <w:rPr>
+          <w:rFonts w:ascii="Times New Roman" w:eastAsia="Times New Roman" w:hAnsi="Times New Roman" w:cs="Times New Roman"/>
+          <w:kern w:val="0"/>
+          <w:sz w:val="24"/>
+          <w:szCs w:val="24"/>
+          <ns2:ligatures ns2:val="none"/>
         </w:rPr>
         <w:t xml:space="preserve">With </w:t>
       </w:r>
@@ -523,29 +523,29 @@
           <w:kern w:val="0"/>
           <w:sz w:val="24"/>
           <w:szCs w:val="24"/>
-          <w14:ligatures w14:val="none"/>
-        </w:rPr>
-        <w:t>PROTEGO</w:t>
-      </w:r>
-      <w:r>
-        <w:rPr>
-          <w:rFonts w:ascii="Times New Roman" w:eastAsia="Times New Roman" w:hAnsi="Times New Roman" w:cs="Times New Roman"/>
-          <w:kern w:val="0"/>
-          <w:sz w:val="24"/>
-          <w:szCs w:val="24"/>
-          <w14:ligatures w14:val="none"/>
-        </w:rPr>
-        <w:t xml:space="preserve"> Protection, filing a claim </w:t>
-      </w:r>
-      <w:r>
-        <w:rPr>
-          <w:rFonts w:ascii="Times New Roman" w:eastAsia="Times New Roman" w:hAnsi="Times New Roman" w:cs="Times New Roman"/>
-          <w:b/>
-          <w:bCs/>
-          <w:kern w:val="0"/>
-          <w:sz w:val="24"/>
-          <w:szCs w:val="24"/>
-          <w14:ligatures w14:val="none"/>
+          <ns2:ligatures ns2:val="none"/>
+        </w:rPr>
+        <w:t>TPP Secure Protection</w:t>
+      </w:r>
+      <w:r>
+        <w:rPr>
+          <w:rFonts w:ascii="Times New Roman" w:eastAsia="Times New Roman" w:hAnsi="Times New Roman" w:cs="Times New Roman"/>
+          <w:kern w:val="0"/>
+          <w:sz w:val="24"/>
+          <w:szCs w:val="24"/>
+          <ns2:ligatures ns2:val="none"/>
+        </w:rPr>
+        <w:t xml:space="preserve">, filing a claim </w:t>
+      </w:r>
+      <w:r>
+        <w:rPr>
+          <w:rFonts w:ascii="Times New Roman" w:eastAsia="Times New Roman" w:hAnsi="Times New Roman" w:cs="Times New Roman"/>
+          <w:b/>
+          <w:bCs/>
+          <w:kern w:val="0"/>
+          <w:sz w:val="24"/>
+          <w:szCs w:val="24"/>
+          <ns2:ligatures ns2:val="none"/>
         </w:rPr>
         <w:t>never affects your personal insurance</w:t>
       </w:r>
@@ -555,7 +555,7 @@
           <w:kern w:val="0"/>
           <w:sz w:val="24"/>
           <w:szCs w:val="24"/>
-          <w14:ligatures w14:val="none"/>
+          <ns2:ligatures ns2:val="none"/>
         </w:rPr>
         <w:t xml:space="preserve">. Your homeowner's or renter's policy stays </w:t>
       </w:r>
@@ -566,7 +566,7 @@
           <w:kern w:val="0"/>
           <w:sz w:val="24"/>
           <w:szCs w:val="24"/>
-          <w14:ligatures w14:val="none"/>
+          <ns2:ligatures ns2:val="none"/>
         </w:rPr>
         <w:t>completely separate</w:t>
       </w:r>
@@ -577,63 +577,63 @@
           <w:kern w:val="0"/>
           <w:sz w:val="24"/>
           <w:szCs w:val="24"/>
-          <w14:ligatures w14:val="none"/>
+          <ns2:ligatures ns2:val="none"/>
         </w:rPr>
         <w:t>—no premium increases, no impact on your claims history.</w:t>
       </w:r>
     </w:p>
-    <w:p>
-      <w:pPr>
-        <w:spacing w:before="100" w:beforeAutospacing="1" w:after="100" w:afterAutospacing="1"/>
-        <w:rPr>
-          <w:rFonts w:ascii="Times New Roman" w:eastAsia="Times New Roman" w:hAnsi="Times New Roman" w:cs="Times New Roman"/>
-          <w:kern w:val="0"/>
-          <w:sz w:val="24"/>
-          <w:szCs w:val="24"/>
-          <w14:ligatures w14:val="none"/>
-        </w:rPr>
-      </w:pPr>
-      <w:r>
-        <w:rPr>
-          <w:rFonts w:ascii="Times New Roman" w:eastAsia="Times New Roman" w:hAnsi="Times New Roman" w:cs="Times New Roman"/>
-          <w:b/>
-          <w:bCs/>
-          <w:kern w:val="0"/>
-          <w:sz w:val="24"/>
-          <w:szCs w:val="24"/>
-          <w14:ligatures w14:val="none"/>
+    <w:p ns2:paraId="7FEF0176" ns2:textId="77777777">
+      <w:pPr>
+        <w:spacing w:before="100" w:beforeAutospacing="1" w:after="100" w:afterAutospacing="1"/>
+        <w:rPr>
+          <w:rFonts w:ascii="Times New Roman" w:eastAsia="Times New Roman" w:hAnsi="Times New Roman" w:cs="Times New Roman"/>
+          <w:kern w:val="0"/>
+          <w:sz w:val="24"/>
+          <w:szCs w:val="24"/>
+          <ns2:ligatures ns2:val="none"/>
+        </w:rPr>
+      </w:pPr>
+      <w:r>
+        <w:rPr>
+          <w:rFonts w:ascii="Times New Roman" w:eastAsia="Times New Roman" w:hAnsi="Times New Roman" w:cs="Times New Roman"/>
+          <w:b/>
+          <w:bCs/>
+          <w:kern w:val="0"/>
+          <w:sz w:val="24"/>
+          <w:szCs w:val="24"/>
+          <ns2:ligatures ns2:val="none"/>
         </w:rPr>
         <w:t>3. Full Replacement Value—Not What Your Items Used to Be Worth</w:t>
       </w:r>
     </w:p>
-    <w:p>
-      <w:pPr>
-        <w:spacing w:before="100" w:beforeAutospacing="1" w:after="100" w:afterAutospacing="1"/>
-        <w:rPr>
-          <w:rFonts w:ascii="Times New Roman" w:eastAsia="Times New Roman" w:hAnsi="Times New Roman" w:cs="Times New Roman"/>
-          <w:kern w:val="0"/>
-          <w:sz w:val="24"/>
-          <w:szCs w:val="24"/>
-          <w14:ligatures w14:val="none"/>
-        </w:rPr>
-      </w:pPr>
-      <w:r>
-        <w:rPr>
-          <w:rFonts w:ascii="Times New Roman" w:eastAsia="Times New Roman" w:hAnsi="Times New Roman" w:cs="Times New Roman"/>
-          <w:kern w:val="0"/>
-          <w:sz w:val="24"/>
-          <w:szCs w:val="24"/>
-          <w14:ligatures w14:val="none"/>
-        </w:rPr>
-        <w:t>PROTEGO</w:t>
-      </w:r>
-      <w:r>
-        <w:rPr>
-          <w:rFonts w:ascii="Times New Roman" w:eastAsia="Times New Roman" w:hAnsi="Times New Roman" w:cs="Times New Roman"/>
-          <w:kern w:val="0"/>
-          <w:sz w:val="24"/>
-          <w:szCs w:val="24"/>
-          <w14:ligatures w14:val="none"/>
+    <w:p ns2:paraId="0F1802EE" ns2:textId="409B78F3">
+      <w:pPr>
+        <w:spacing w:before="100" w:beforeAutospacing="1" w:after="100" w:afterAutospacing="1"/>
+        <w:rPr>
+          <w:rFonts w:ascii="Times New Roman" w:eastAsia="Times New Roman" w:hAnsi="Times New Roman" w:cs="Times New Roman"/>
+          <w:kern w:val="0"/>
+          <w:sz w:val="24"/>
+          <w:szCs w:val="24"/>
+          <ns2:ligatures ns2:val="none"/>
+        </w:rPr>
+      </w:pPr>
+      <w:r>
+        <w:rPr>
+          <w:rFonts w:ascii="Times New Roman" w:eastAsia="Times New Roman" w:hAnsi="Times New Roman" w:cs="Times New Roman"/>
+          <w:kern w:val="0"/>
+          <w:sz w:val="24"/>
+          <w:szCs w:val="24"/>
+          <ns2:ligatures ns2:val="none"/>
+        </w:rPr>
+        <w:t>TPP Secure</w:t>
+      </w:r>
+      <w:r>
+        <w:rPr>
+          <w:rFonts w:ascii="Times New Roman" w:eastAsia="Times New Roman" w:hAnsi="Times New Roman" w:cs="Times New Roman"/>
+          <w:kern w:val="0"/>
+          <w:sz w:val="24"/>
+          <w:szCs w:val="24"/>
+          <ns2:ligatures ns2:val="none"/>
         </w:rPr>
         <w:t xml:space="preserve"> pays what it costs to replace your items </w:t>
       </w:r>
@@ -645,7 +645,7 @@
           <w:kern w:val="0"/>
           <w:sz w:val="24"/>
           <w:szCs w:val="24"/>
-          <w14:ligatures w14:val="none"/>
+          <ns2:ligatures ns2:val="none"/>
         </w:rPr>
         <w:t>today</w:t>
       </w:r>
@@ -655,7 +655,7 @@
           <w:kern w:val="0"/>
           <w:sz w:val="24"/>
           <w:szCs w:val="24"/>
-          <w14:ligatures w14:val="none"/>
+          <ns2:ligatures ns2:val="none"/>
         </w:rPr>
         <w:t xml:space="preserve">. No depreciation calculations. No arguments about "actual cash value." You get what you need to </w:t>
       </w:r>
@@ -666,7 +666,7 @@
           <w:kern w:val="0"/>
           <w:sz w:val="24"/>
           <w:szCs w:val="24"/>
-          <w14:ligatures w14:val="none"/>
+          <ns2:ligatures ns2:val="none"/>
         </w:rPr>
         <w:t>actually replace</w:t>
       </w:r>
@@ -677,53 +677,53 @@
           <w:kern w:val="0"/>
           <w:sz w:val="24"/>
           <w:szCs w:val="24"/>
-          <w14:ligatures w14:val="none"/>
+          <ns2:ligatures ns2:val="none"/>
         </w:rPr>
         <w:t xml:space="preserve"> your belongings.</w:t>
       </w:r>
     </w:p>
-    <w:p>
-      <w:pPr>
-        <w:spacing w:before="100" w:beforeAutospacing="1" w:after="100" w:afterAutospacing="1"/>
-        <w:rPr>
-          <w:rFonts w:ascii="Times New Roman" w:eastAsia="Times New Roman" w:hAnsi="Times New Roman" w:cs="Times New Roman"/>
-          <w:kern w:val="0"/>
-          <w:sz w:val="24"/>
-          <w:szCs w:val="24"/>
-          <w14:ligatures w14:val="none"/>
-        </w:rPr>
-      </w:pPr>
-      <w:r>
-        <w:rPr>
-          <w:rFonts w:ascii="Times New Roman" w:eastAsia="Times New Roman" w:hAnsi="Times New Roman" w:cs="Times New Roman"/>
-          <w:b/>
-          <w:bCs/>
-          <w:kern w:val="0"/>
-          <w:sz w:val="24"/>
-          <w:szCs w:val="24"/>
-          <w14:ligatures w14:val="none"/>
+    <w:p ns2:paraId="27353011" ns2:textId="77777777">
+      <w:pPr>
+        <w:spacing w:before="100" w:beforeAutospacing="1" w:after="100" w:afterAutospacing="1"/>
+        <w:rPr>
+          <w:rFonts w:ascii="Times New Roman" w:eastAsia="Times New Roman" w:hAnsi="Times New Roman" w:cs="Times New Roman"/>
+          <w:kern w:val="0"/>
+          <w:sz w:val="24"/>
+          <w:szCs w:val="24"/>
+          <ns2:ligatures ns2:val="none"/>
+        </w:rPr>
+      </w:pPr>
+      <w:r>
+        <w:rPr>
+          <w:rFonts w:ascii="Times New Roman" w:eastAsia="Times New Roman" w:hAnsi="Times New Roman" w:cs="Times New Roman"/>
+          <w:b/>
+          <w:bCs/>
+          <w:kern w:val="0"/>
+          <w:sz w:val="24"/>
+          <w:szCs w:val="24"/>
+          <ns2:ligatures ns2:val="none"/>
         </w:rPr>
         <w:t>4. Built for Self-Storage—No Coverage Gaps</w:t>
       </w:r>
     </w:p>
-    <w:p>
-      <w:pPr>
-        <w:spacing w:before="100" w:beforeAutospacing="1" w:after="100" w:afterAutospacing="1"/>
-        <w:rPr>
-          <w:rFonts w:ascii="Times New Roman" w:eastAsia="Times New Roman" w:hAnsi="Times New Roman" w:cs="Times New Roman"/>
-          <w:kern w:val="0"/>
-          <w:sz w:val="24"/>
-          <w:szCs w:val="24"/>
-          <w14:ligatures w14:val="none"/>
-        </w:rPr>
-      </w:pPr>
-      <w:r>
-        <w:rPr>
-          <w:rFonts w:ascii="Times New Roman" w:eastAsia="Times New Roman" w:hAnsi="Times New Roman" w:cs="Times New Roman"/>
-          <w:kern w:val="0"/>
-          <w:sz w:val="24"/>
-          <w:szCs w:val="24"/>
-          <w14:ligatures w14:val="none"/>
+    <w:p ns2:paraId="3E81BA38" ns2:textId="55CF3B89">
+      <w:pPr>
+        <w:spacing w:before="100" w:beforeAutospacing="1" w:after="100" w:afterAutospacing="1"/>
+        <w:rPr>
+          <w:rFonts w:ascii="Times New Roman" w:eastAsia="Times New Roman" w:hAnsi="Times New Roman" w:cs="Times New Roman"/>
+          <w:kern w:val="0"/>
+          <w:sz w:val="24"/>
+          <w:szCs w:val="24"/>
+          <ns2:ligatures ns2:val="none"/>
+        </w:rPr>
+      </w:pPr>
+      <w:r>
+        <w:rPr>
+          <w:rFonts w:ascii="Times New Roman" w:eastAsia="Times New Roman" w:hAnsi="Times New Roman" w:cs="Times New Roman"/>
+          <w:kern w:val="0"/>
+          <w:sz w:val="24"/>
+          <w:szCs w:val="24"/>
+          <ns2:ligatures ns2:val="none"/>
         </w:rPr>
         <w:t xml:space="preserve">Many homeowner's and renter's policies exclude, limit, or complicate coverage for items stored offsite. </w:t>
       </w:r>
@@ -733,22 +733,22 @@
           <w:kern w:val="0"/>
           <w:sz w:val="24"/>
           <w:szCs w:val="24"/>
-          <w14:ligatures w14:val="none"/>
-        </w:rPr>
-        <w:t>PROTEGO</w:t>
-      </w:r>
-      <w:r>
-        <w:rPr>
-          <w:rFonts w:ascii="Times New Roman" w:eastAsia="Times New Roman" w:hAnsi="Times New Roman" w:cs="Times New Roman"/>
-          <w:kern w:val="0"/>
-          <w:sz w:val="24"/>
-          <w:szCs w:val="24"/>
-          <w14:ligatures w14:val="none"/>
-        </w:rPr>
-        <w:t xml:space="preserve"> Protection is designed exclusively for self-storage, covering the real threats:</w:t>
-      </w:r>
-    </w:p>
-    <w:p>
+          <ns2:ligatures ns2:val="none"/>
+        </w:rPr>
+        <w:t>TPP Secure Protection</w:t>
+      </w:r>
+      <w:r>
+        <w:rPr>
+          <w:rFonts w:ascii="Times New Roman" w:eastAsia="Times New Roman" w:hAnsi="Times New Roman" w:cs="Times New Roman"/>
+          <w:kern w:val="0"/>
+          <w:sz w:val="24"/>
+          <w:szCs w:val="24"/>
+          <ns2:ligatures ns2:val="none"/>
+        </w:rPr>
+        <w:t xml:space="preserve"> is designed exclusively for self-storage, covering the real threats:</w:t>
+      </w:r>
+    </w:p>
+    <w:p ns2:paraId="11D1B91C" ns2:textId="77777777">
       <w:pPr>
         <w:numPr>
           <w:ilvl w:val="0"/>
@@ -760,22 +760,22 @@
           <w:kern w:val="0"/>
           <w:sz w:val="24"/>
           <w:szCs w:val="24"/>
-          <w14:ligatures w14:val="none"/>
-        </w:rPr>
-      </w:pPr>
-      <w:r>
-        <w:rPr>
-          <w:rFonts w:ascii="Times New Roman" w:eastAsia="Times New Roman" w:hAnsi="Times New Roman" w:cs="Times New Roman"/>
-          <w:kern w:val="0"/>
-          <w:sz w:val="24"/>
-          <w:szCs w:val="24"/>
-          <w14:ligatures w14:val="none"/>
+          <ns2:ligatures ns2:val="none"/>
+        </w:rPr>
+      </w:pPr>
+      <w:r>
+        <w:rPr>
+          <w:rFonts w:ascii="Times New Roman" w:eastAsia="Times New Roman" w:hAnsi="Times New Roman" w:cs="Times New Roman"/>
+          <w:kern w:val="0"/>
+          <w:sz w:val="24"/>
+          <w:szCs w:val="24"/>
+          <ns2:ligatures ns2:val="none"/>
         </w:rPr>
         <w:lastRenderedPageBreak/>
         <w:t>Fire and explosion</w:t>
       </w:r>
     </w:p>
-    <w:p>
+    <w:p ns2:paraId="35B71494" ns2:textId="77777777">
       <w:pPr>
         <w:numPr>
           <w:ilvl w:val="0"/>
@@ -787,21 +787,21 @@
           <w:kern w:val="0"/>
           <w:sz w:val="24"/>
           <w:szCs w:val="24"/>
-          <w14:ligatures w14:val="none"/>
-        </w:rPr>
-      </w:pPr>
-      <w:r>
-        <w:rPr>
-          <w:rFonts w:ascii="Times New Roman" w:eastAsia="Times New Roman" w:hAnsi="Times New Roman" w:cs="Times New Roman"/>
-          <w:kern w:val="0"/>
-          <w:sz w:val="24"/>
-          <w:szCs w:val="24"/>
-          <w14:ligatures w14:val="none"/>
+          <ns2:ligatures ns2:val="none"/>
+        </w:rPr>
+      </w:pPr>
+      <w:r>
+        <w:rPr>
+          <w:rFonts w:ascii="Times New Roman" w:eastAsia="Times New Roman" w:hAnsi="Times New Roman" w:cs="Times New Roman"/>
+          <w:kern w:val="0"/>
+          <w:sz w:val="24"/>
+          <w:szCs w:val="24"/>
+          <ns2:ligatures ns2:val="none"/>
         </w:rPr>
         <w:t>Theft and burglary</w:t>
       </w:r>
     </w:p>
-    <w:p>
+    <w:p ns2:paraId="4B9D4E74" ns2:textId="77777777">
       <w:pPr>
         <w:numPr>
           <w:ilvl w:val="0"/>
@@ -813,21 +813,21 @@
           <w:kern w:val="0"/>
           <w:sz w:val="24"/>
           <w:szCs w:val="24"/>
-          <w14:ligatures w14:val="none"/>
-        </w:rPr>
-      </w:pPr>
-      <w:r>
-        <w:rPr>
-          <w:rFonts w:ascii="Times New Roman" w:eastAsia="Times New Roman" w:hAnsi="Times New Roman" w:cs="Times New Roman"/>
-          <w:kern w:val="0"/>
-          <w:sz w:val="24"/>
-          <w:szCs w:val="24"/>
-          <w14:ligatures w14:val="none"/>
+          <ns2:ligatures ns2:val="none"/>
+        </w:rPr>
+      </w:pPr>
+      <w:r>
+        <w:rPr>
+          <w:rFonts w:ascii="Times New Roman" w:eastAsia="Times New Roman" w:hAnsi="Times New Roman" w:cs="Times New Roman"/>
+          <w:kern w:val="0"/>
+          <w:sz w:val="24"/>
+          <w:szCs w:val="24"/>
+          <ns2:ligatures ns2:val="none"/>
         </w:rPr>
         <w:t>Water damage</w:t>
       </w:r>
     </w:p>
-    <w:p>
+    <w:p ns2:paraId="6CD78610" ns2:textId="77777777">
       <w:pPr>
         <w:numPr>
           <w:ilvl w:val="0"/>
@@ -839,21 +839,21 @@
           <w:kern w:val="0"/>
           <w:sz w:val="24"/>
           <w:szCs w:val="24"/>
-          <w14:ligatures w14:val="none"/>
-        </w:rPr>
-      </w:pPr>
-      <w:r>
-        <w:rPr>
-          <w:rFonts w:ascii="Times New Roman" w:eastAsia="Times New Roman" w:hAnsi="Times New Roman" w:cs="Times New Roman"/>
-          <w:kern w:val="0"/>
-          <w:sz w:val="24"/>
-          <w:szCs w:val="24"/>
-          <w14:ligatures w14:val="none"/>
+          <ns2:ligatures ns2:val="none"/>
+        </w:rPr>
+      </w:pPr>
+      <w:r>
+        <w:rPr>
+          <w:rFonts w:ascii="Times New Roman" w:eastAsia="Times New Roman" w:hAnsi="Times New Roman" w:cs="Times New Roman"/>
+          <w:kern w:val="0"/>
+          <w:sz w:val="24"/>
+          <w:szCs w:val="24"/>
+          <ns2:ligatures ns2:val="none"/>
         </w:rPr>
         <w:t>Windstorms and building collapse</w:t>
       </w:r>
     </w:p>
-    <w:p>
+    <w:p ns2:paraId="233F106C" ns2:textId="77777777">
       <w:pPr>
         <w:numPr>
           <w:ilvl w:val="0"/>
@@ -865,21 +865,21 @@
           <w:kern w:val="0"/>
           <w:sz w:val="24"/>
           <w:szCs w:val="24"/>
-          <w14:ligatures w14:val="none"/>
-        </w:rPr>
-      </w:pPr>
-      <w:r>
-        <w:rPr>
-          <w:rFonts w:ascii="Times New Roman" w:eastAsia="Times New Roman" w:hAnsi="Times New Roman" w:cs="Times New Roman"/>
-          <w:kern w:val="0"/>
-          <w:sz w:val="24"/>
-          <w:szCs w:val="24"/>
-          <w14:ligatures w14:val="none"/>
+          <ns2:ligatures ns2:val="none"/>
+        </w:rPr>
+      </w:pPr>
+      <w:r>
+        <w:rPr>
+          <w:rFonts w:ascii="Times New Roman" w:eastAsia="Times New Roman" w:hAnsi="Times New Roman" w:cs="Times New Roman"/>
+          <w:kern w:val="0"/>
+          <w:sz w:val="24"/>
+          <w:szCs w:val="24"/>
+          <ns2:ligatures ns2:val="none"/>
         </w:rPr>
         <w:t>Vandalism</w:t>
       </w:r>
     </w:p>
-    <w:p>
+    <w:p ns2:paraId="4565B568" ns2:textId="77777777">
       <w:pPr>
         <w:numPr>
           <w:ilvl w:val="0"/>
@@ -891,62 +891,62 @@
           <w:kern w:val="0"/>
           <w:sz w:val="24"/>
           <w:szCs w:val="24"/>
-          <w14:ligatures w14:val="none"/>
-        </w:rPr>
-      </w:pPr>
-      <w:r>
-        <w:rPr>
-          <w:rFonts w:ascii="Times New Roman" w:eastAsia="Times New Roman" w:hAnsi="Times New Roman" w:cs="Times New Roman"/>
-          <w:kern w:val="0"/>
-          <w:sz w:val="24"/>
-          <w:szCs w:val="24"/>
-          <w14:ligatures w14:val="none"/>
+          <ns2:ligatures ns2:val="none"/>
+        </w:rPr>
+      </w:pPr>
+      <w:r>
+        <w:rPr>
+          <w:rFonts w:ascii="Times New Roman" w:eastAsia="Times New Roman" w:hAnsi="Times New Roman" w:cs="Times New Roman"/>
+          <w:kern w:val="0"/>
+          <w:sz w:val="24"/>
+          <w:szCs w:val="24"/>
+          <ns2:ligatures ns2:val="none"/>
         </w:rPr>
         <w:t>Rodent damage (up to $500)</w:t>
       </w:r>
     </w:p>
-    <w:p>
-      <w:pPr>
-        <w:spacing w:before="100" w:beforeAutospacing="1" w:after="100" w:afterAutospacing="1"/>
-        <w:rPr>
-          <w:rFonts w:ascii="Times New Roman" w:eastAsia="Times New Roman" w:hAnsi="Times New Roman" w:cs="Times New Roman"/>
-          <w:kern w:val="0"/>
-          <w:sz w:val="24"/>
-          <w:szCs w:val="24"/>
-          <w14:ligatures w14:val="none"/>
-        </w:rPr>
-      </w:pPr>
-      <w:r>
-        <w:rPr>
-          <w:rFonts w:ascii="Times New Roman" w:eastAsia="Times New Roman" w:hAnsi="Times New Roman" w:cs="Times New Roman"/>
-          <w:b/>
-          <w:bCs/>
-          <w:kern w:val="0"/>
-          <w:sz w:val="24"/>
-          <w:szCs w:val="24"/>
-          <w14:ligatures w14:val="none"/>
+    <w:p ns2:paraId="69ED3D22" ns2:textId="77777777">
+      <w:pPr>
+        <w:spacing w:before="100" w:beforeAutospacing="1" w:after="100" w:afterAutospacing="1"/>
+        <w:rPr>
+          <w:rFonts w:ascii="Times New Roman" w:eastAsia="Times New Roman" w:hAnsi="Times New Roman" w:cs="Times New Roman"/>
+          <w:kern w:val="0"/>
+          <w:sz w:val="24"/>
+          <w:szCs w:val="24"/>
+          <ns2:ligatures ns2:val="none"/>
+        </w:rPr>
+      </w:pPr>
+      <w:r>
+        <w:rPr>
+          <w:rFonts w:ascii="Times New Roman" w:eastAsia="Times New Roman" w:hAnsi="Times New Roman" w:cs="Times New Roman"/>
+          <w:b/>
+          <w:bCs/>
+          <w:kern w:val="0"/>
+          <w:sz w:val="24"/>
+          <w:szCs w:val="24"/>
+          <ns2:ligatures ns2:val="none"/>
         </w:rPr>
         <w:t>5. Claims Made Simple</w:t>
       </w:r>
     </w:p>
-    <w:p>
-      <w:pPr>
-        <w:spacing w:before="100" w:beforeAutospacing="1" w:after="100" w:afterAutospacing="1"/>
-        <w:rPr>
-          <w:rFonts w:ascii="Times New Roman" w:eastAsia="Times New Roman" w:hAnsi="Times New Roman" w:cs="Times New Roman"/>
-          <w:kern w:val="0"/>
-          <w:sz w:val="24"/>
-          <w:szCs w:val="24"/>
-          <w14:ligatures w14:val="none"/>
-        </w:rPr>
-      </w:pPr>
-      <w:r>
-        <w:rPr>
-          <w:rFonts w:ascii="Times New Roman" w:eastAsia="Times New Roman" w:hAnsi="Times New Roman" w:cs="Times New Roman"/>
-          <w:kern w:val="0"/>
-          <w:sz w:val="24"/>
-          <w:szCs w:val="24"/>
-          <w14:ligatures w14:val="none"/>
+    <w:p ns2:paraId="4D4F1FD6" ns2:textId="5E42DC07">
+      <w:pPr>
+        <w:spacing w:before="100" w:beforeAutospacing="1" w:after="100" w:afterAutospacing="1"/>
+        <w:rPr>
+          <w:rFonts w:ascii="Times New Roman" w:eastAsia="Times New Roman" w:hAnsi="Times New Roman" w:cs="Times New Roman"/>
+          <w:kern w:val="0"/>
+          <w:sz w:val="24"/>
+          <w:szCs w:val="24"/>
+          <ns2:ligatures ns2:val="none"/>
+        </w:rPr>
+      </w:pPr>
+      <w:r>
+        <w:rPr>
+          <w:rFonts w:ascii="Times New Roman" w:eastAsia="Times New Roman" w:hAnsi="Times New Roman" w:cs="Times New Roman"/>
+          <w:kern w:val="0"/>
+          <w:sz w:val="24"/>
+          <w:szCs w:val="24"/>
+          <ns2:ligatures ns2:val="none"/>
         </w:rPr>
         <w:t xml:space="preserve">File 24/7 at </w:t>
       </w:r>
@@ -958,29 +958,29 @@
           <w:kern w:val="0"/>
           <w:sz w:val="24"/>
           <w:szCs w:val="24"/>
-          <w14:ligatures w14:val="none"/>
-        </w:rPr>
-        <w:t>PROTEGO</w:t>
-      </w:r>
-      <w:r>
-        <w:rPr>
-          <w:rFonts w:ascii="Times New Roman" w:eastAsia="Times New Roman" w:hAnsi="Times New Roman" w:cs="Times New Roman"/>
-          <w:b/>
-          <w:bCs/>
-          <w:kern w:val="0"/>
-          <w:sz w:val="24"/>
-          <w:szCs w:val="24"/>
-          <w14:ligatures w14:val="none"/>
-        </w:rPr>
-        <w:t>Claims.com</w:t>
-      </w:r>
-      <w:r>
-        <w:rPr>
-          <w:rFonts w:ascii="Times New Roman" w:eastAsia="Times New Roman" w:hAnsi="Times New Roman" w:cs="Times New Roman"/>
-          <w:kern w:val="0"/>
-          <w:sz w:val="24"/>
-          <w:szCs w:val="24"/>
-          <w14:ligatures w14:val="none"/>
+          <ns2:ligatures ns2:val="none"/>
+        </w:rPr>
+        <w:t>TPPClaims.com</w:t>
+      </w:r>
+      <w:r>
+        <w:rPr>
+          <w:rFonts w:ascii="Times New Roman" w:eastAsia="Times New Roman" w:hAnsi="Times New Roman" w:cs="Times New Roman"/>
+          <w:b/>
+          <w:bCs/>
+          <w:kern w:val="0"/>
+          <w:sz w:val="24"/>
+          <w:szCs w:val="24"/>
+          <ns2:ligatures ns2:val="none"/>
+        </w:rPr>
+        <w:t/>
+      </w:r>
+      <w:r>
+        <w:rPr>
+          <w:rFonts w:ascii="Times New Roman" w:eastAsia="Times New Roman" w:hAnsi="Times New Roman" w:cs="Times New Roman"/>
+          <w:kern w:val="0"/>
+          <w:sz w:val="24"/>
+          <w:szCs w:val="24"/>
+          <ns2:ligatures ns2:val="none"/>
         </w:rPr>
         <w:t xml:space="preserve"> with a dedicated U.S.-based claims team. No waiting months for reimbursements. No complicated processes. </w:t>
       </w:r>
@@ -990,17 +990,17 @@
           <w:kern w:val="0"/>
           <w:sz w:val="24"/>
           <w:szCs w:val="24"/>
-          <w14:ligatures w14:val="none"/>
-        </w:rPr>
-        <w:t>PROTEGO</w:t>
-      </w:r>
-      <w:r>
-        <w:rPr>
-          <w:rFonts w:ascii="Times New Roman" w:eastAsia="Times New Roman" w:hAnsi="Times New Roman" w:cs="Times New Roman"/>
-          <w:kern w:val="0"/>
-          <w:sz w:val="24"/>
-          <w:szCs w:val="24"/>
-          <w14:ligatures w14:val="none"/>
+          <ns2:ligatures ns2:val="none"/>
+        </w:rPr>
+        <w:t>TPP Secure</w:t>
+      </w:r>
+      <w:r>
+        <w:rPr>
+          <w:rFonts w:ascii="Times New Roman" w:eastAsia="Times New Roman" w:hAnsi="Times New Roman" w:cs="Times New Roman"/>
+          <w:kern w:val="0"/>
+          <w:sz w:val="24"/>
+          <w:szCs w:val="24"/>
+          <ns2:ligatures ns2:val="none"/>
         </w:rPr>
         <w:t xml:space="preserve"> has been named </w:t>
       </w:r>
@@ -1012,7 +1012,7 @@
           <w:kern w:val="0"/>
           <w:sz w:val="24"/>
           <w:szCs w:val="24"/>
-          <w14:ligatures w14:val="none"/>
+          <ns2:ligatures ns2:val="none"/>
         </w:rPr>
         <w:t>Inside Self-Storage "Best of Business Tenant Protection Program"</w:t>
       </w:r>
@@ -1022,77 +1022,77 @@
           <w:kern w:val="0"/>
           <w:sz w:val="24"/>
           <w:szCs w:val="24"/>
-          <w14:ligatures w14:val="none"/>
+          <ns2:ligatures ns2:val="none"/>
         </w:rPr>
         <w:t xml:space="preserve"> for eight consecutive years because they deliver when it matters.</w:t>
       </w:r>
     </w:p>
-    <w:p>
-      <w:pPr>
-        <w:spacing w:before="100" w:beforeAutospacing="1" w:after="100" w:afterAutospacing="1"/>
-        <w:rPr>
-          <w:rFonts w:ascii="Times New Roman" w:eastAsia="Times New Roman" w:hAnsi="Times New Roman" w:cs="Times New Roman"/>
-          <w:kern w:val="0"/>
-          <w:sz w:val="24"/>
-          <w:szCs w:val="24"/>
-          <w14:ligatures w14:val="none"/>
-        </w:rPr>
-      </w:pPr>
-      <w:r>
-        <w:rPr>
-          <w:rFonts w:ascii="Times New Roman" w:eastAsia="Times New Roman" w:hAnsi="Times New Roman" w:cs="Times New Roman"/>
-          <w:b/>
-          <w:bCs/>
-          <w:kern w:val="0"/>
-          <w:sz w:val="24"/>
-          <w:szCs w:val="24"/>
-          <w14:ligatures w14:val="none"/>
+    <w:p ns2:paraId="6F853074" ns2:textId="77777777">
+      <w:pPr>
+        <w:spacing w:before="100" w:beforeAutospacing="1" w:after="100" w:afterAutospacing="1"/>
+        <w:rPr>
+          <w:rFonts w:ascii="Times New Roman" w:eastAsia="Times New Roman" w:hAnsi="Times New Roman" w:cs="Times New Roman"/>
+          <w:kern w:val="0"/>
+          <w:sz w:val="24"/>
+          <w:szCs w:val="24"/>
+          <ns2:ligatures ns2:val="none"/>
+        </w:rPr>
+      </w:pPr>
+      <w:r>
+        <w:rPr>
+          <w:rFonts w:ascii="Times New Roman" w:eastAsia="Times New Roman" w:hAnsi="Times New Roman" w:cs="Times New Roman"/>
+          <w:b/>
+          <w:bCs/>
+          <w:kern w:val="0"/>
+          <w:sz w:val="24"/>
+          <w:szCs w:val="24"/>
+          <ns2:ligatures ns2:val="none"/>
         </w:rPr>
         <w:t>6. No Long-Term Commitment</w:t>
       </w:r>
     </w:p>
-    <w:p>
-      <w:pPr>
-        <w:spacing w:before="100" w:beforeAutospacing="1" w:after="100" w:afterAutospacing="1"/>
-        <w:rPr>
-          <w:rFonts w:ascii="Times New Roman" w:eastAsia="Times New Roman" w:hAnsi="Times New Roman" w:cs="Times New Roman"/>
-          <w:kern w:val="0"/>
-          <w:sz w:val="24"/>
-          <w:szCs w:val="24"/>
-          <w14:ligatures w14:val="none"/>
-        </w:rPr>
-      </w:pPr>
-      <w:r>
-        <w:rPr>
-          <w:rFonts w:ascii="Times New Roman" w:eastAsia="Times New Roman" w:hAnsi="Times New Roman" w:cs="Times New Roman"/>
-          <w:kern w:val="0"/>
-          <w:sz w:val="24"/>
-          <w:szCs w:val="24"/>
-          <w14:ligatures w14:val="none"/>
+    <w:p ns2:paraId="63A0B891" ns2:textId="77777777">
+      <w:pPr>
+        <w:spacing w:before="100" w:beforeAutospacing="1" w:after="100" w:afterAutospacing="1"/>
+        <w:rPr>
+          <w:rFonts w:ascii="Times New Roman" w:eastAsia="Times New Roman" w:hAnsi="Times New Roman" w:cs="Times New Roman"/>
+          <w:kern w:val="0"/>
+          <w:sz w:val="24"/>
+          <w:szCs w:val="24"/>
+          <ns2:ligatures ns2:val="none"/>
+        </w:rPr>
+      </w:pPr>
+      <w:r>
+        <w:rPr>
+          <w:rFonts w:ascii="Times New Roman" w:eastAsia="Times New Roman" w:hAnsi="Times New Roman" w:cs="Times New Roman"/>
+          <w:kern w:val="0"/>
+          <w:sz w:val="24"/>
+          <w:szCs w:val="24"/>
+          <ns2:ligatures ns2:val="none"/>
         </w:rPr>
         <w:t>Need to cancel? You can do so anytime. Your protection automatically ends when your rental ends—no hidden fees or hassles.</w:t>
       </w:r>
     </w:p>
-    <w:p>
-      <w:pPr>
-        <w:spacing w:before="100" w:beforeAutospacing="1" w:after="100" w:afterAutospacing="1"/>
-        <w:rPr>
-          <w:rFonts w:ascii="Times New Roman" w:eastAsia="Times New Roman" w:hAnsi="Times New Roman" w:cs="Times New Roman"/>
-          <w:kern w:val="0"/>
-          <w:sz w:val="24"/>
-          <w:szCs w:val="24"/>
-          <w14:ligatures w14:val="none"/>
-        </w:rPr>
-      </w:pPr>
-      <w:r>
-        <w:rPr>
-          <w:rFonts w:ascii="Times New Roman" w:eastAsia="Times New Roman" w:hAnsi="Times New Roman" w:cs="Times New Roman"/>
-          <w:b/>
-          <w:bCs/>
-          <w:kern w:val="0"/>
-          <w:sz w:val="24"/>
-          <w:szCs w:val="24"/>
-          <w14:ligatures w14:val="none"/>
+    <w:p ns2:paraId="27D57835" ns2:textId="0583E541">
+      <w:pPr>
+        <w:spacing w:before="100" w:beforeAutospacing="1" w:after="100" w:afterAutospacing="1"/>
+        <w:rPr>
+          <w:rFonts w:ascii="Times New Roman" w:eastAsia="Times New Roman" w:hAnsi="Times New Roman" w:cs="Times New Roman"/>
+          <w:kern w:val="0"/>
+          <w:sz w:val="24"/>
+          <w:szCs w:val="24"/>
+          <ns2:ligatures ns2:val="none"/>
+        </w:rPr>
+      </w:pPr>
+      <w:r>
+        <w:rPr>
+          <w:rFonts w:ascii="Times New Roman" w:eastAsia="Times New Roman" w:hAnsi="Times New Roman" w:cs="Times New Roman"/>
+          <w:b/>
+          <w:bCs/>
+          <w:kern w:val="0"/>
+          <w:sz w:val="24"/>
+          <w:szCs w:val="24"/>
+          <ns2:ligatures ns2:val="none"/>
         </w:rPr>
         <w:t>Do the Math:</w:t>
       </w:r>
@@ -1102,7 +1102,7 @@
           <w:kern w:val="0"/>
           <w:sz w:val="24"/>
           <w:szCs w:val="24"/>
-          <w14:ligatures w14:val="none"/>
+          <ns2:ligatures ns2:val="none"/>
         </w:rPr>
         <w:t xml:space="preserve"> Many tenants save money by switching to </w:t>
       </w:r>
@@ -1112,41 +1112,41 @@
           <w:kern w:val="0"/>
           <w:sz w:val="24"/>
           <w:szCs w:val="24"/>
-          <w14:ligatures w14:val="none"/>
-        </w:rPr>
-        <w:t>PROTEGO</w:t>
-      </w:r>
-      <w:r>
-        <w:rPr>
-          <w:rFonts w:ascii="Times New Roman" w:eastAsia="Times New Roman" w:hAnsi="Times New Roman" w:cs="Times New Roman"/>
-          <w:kern w:val="0"/>
-          <w:sz w:val="24"/>
-          <w:szCs w:val="24"/>
-          <w14:ligatures w14:val="none"/>
-        </w:rPr>
-        <w:t xml:space="preserve"> Protection at $144/year instead of risking a single claim that raises their homeowner's insurance premiums by $200-500 per year for years to come.</w:t>
-      </w:r>
-    </w:p>
-    <w:p>
-      <w:pPr>
-        <w:spacing w:before="100" w:beforeAutospacing="1" w:after="100" w:afterAutospacing="1"/>
-        <w:rPr>
-          <w:rFonts w:ascii="Times New Roman" w:eastAsia="Times New Roman" w:hAnsi="Times New Roman" w:cs="Times New Roman"/>
-          <w:kern w:val="0"/>
-          <w:sz w:val="24"/>
-          <w:szCs w:val="24"/>
-          <w14:ligatures w14:val="none"/>
-        </w:rPr>
-      </w:pPr>
-      <w:r>
-        <w:rPr>
-          <w:rFonts w:ascii="Times New Roman" w:eastAsia="Times New Roman" w:hAnsi="Times New Roman" w:cs="Times New Roman"/>
-          <w:b/>
-          <w:bCs/>
-          <w:kern w:val="0"/>
-          <w:sz w:val="24"/>
-          <w:szCs w:val="24"/>
-          <w14:ligatures w14:val="none"/>
+          <ns2:ligatures ns2:val="none"/>
+        </w:rPr>
+        <w:t>TPP Secure Protection</w:t>
+      </w:r>
+      <w:r>
+        <w:rPr>
+          <w:rFonts w:ascii="Times New Roman" w:eastAsia="Times New Roman" w:hAnsi="Times New Roman" w:cs="Times New Roman"/>
+          <w:kern w:val="0"/>
+          <w:sz w:val="24"/>
+          <w:szCs w:val="24"/>
+          <ns2:ligatures ns2:val="none"/>
+        </w:rPr>
+        <w:t xml:space="preserve"> at $144/year instead of risking a single claim that raises their homeowner's insurance premiums by $200-500 per year for years to come.</w:t>
+      </w:r>
+    </w:p>
+    <w:p ns2:paraId="43714173" ns2:textId="77777777">
+      <w:pPr>
+        <w:spacing w:before="100" w:beforeAutospacing="1" w:after="100" w:afterAutospacing="1"/>
+        <w:rPr>
+          <w:rFonts w:ascii="Times New Roman" w:eastAsia="Times New Roman" w:hAnsi="Times New Roman" w:cs="Times New Roman"/>
+          <w:kern w:val="0"/>
+          <w:sz w:val="24"/>
+          <w:szCs w:val="24"/>
+          <ns2:ligatures ns2:val="none"/>
+        </w:rPr>
+      </w:pPr>
+      <w:r>
+        <w:rPr>
+          <w:rFonts w:ascii="Times New Roman" w:eastAsia="Times New Roman" w:hAnsi="Times New Roman" w:cs="Times New Roman"/>
+          <w:b/>
+          <w:bCs/>
+          <w:kern w:val="0"/>
+          <w:sz w:val="24"/>
+          <w:szCs w:val="24"/>
+          <ns2:ligatures ns2:val="none"/>
         </w:rPr>
         <w:t>Need more coverage?</w:t>
       </w:r>
@@ -1156,12 +1156,12 @@
           <w:kern w:val="0"/>
           <w:sz w:val="24"/>
           <w:szCs w:val="24"/>
-          <w14:ligatures w14:val="none"/>
+          <ns2:ligatures ns2:val="none"/>
         </w:rPr>
         <w:t xml:space="preserve"> Upgrade anytime:</w:t>
       </w:r>
     </w:p>
-    <w:p>
+    <w:p ns2:paraId="6AE8BB75" ns2:textId="77777777">
       <w:pPr>
         <w:numPr>
           <w:ilvl w:val="0"/>
@@ -1173,18 +1173,18 @@
           <w:kern w:val="0"/>
           <w:sz w:val="24"/>
           <w:szCs w:val="24"/>
-          <w14:ligatures w14:val="none"/>
-        </w:rPr>
-      </w:pPr>
-      <w:r>
-        <w:rPr>
-          <w:rFonts w:ascii="Times New Roman" w:eastAsia="Times New Roman" w:hAnsi="Times New Roman" w:cs="Times New Roman"/>
-          <w:b/>
-          <w:bCs/>
-          <w:kern w:val="0"/>
-          <w:sz w:val="24"/>
-          <w:szCs w:val="24"/>
-          <w14:ligatures w14:val="none"/>
+          <ns2:ligatures ns2:val="none"/>
+        </w:rPr>
+      </w:pPr>
+      <w:r>
+        <w:rPr>
+          <w:rFonts w:ascii="Times New Roman" w:eastAsia="Times New Roman" w:hAnsi="Times New Roman" w:cs="Times New Roman"/>
+          <w:b/>
+          <w:bCs/>
+          <w:kern w:val="0"/>
+          <w:sz w:val="24"/>
+          <w:szCs w:val="24"/>
+          <ns2:ligatures ns2:val="none"/>
         </w:rPr>
         <w:t>$3,000 protection</w:t>
       </w:r>
@@ -1194,12 +1194,12 @@
           <w:kern w:val="0"/>
           <w:sz w:val="24"/>
           <w:szCs w:val="24"/>
-          <w14:ligatures w14:val="none"/>
+          <ns2:ligatures ns2:val="none"/>
         </w:rPr>
         <w:t xml:space="preserve"> – $15/month</w:t>
       </w:r>
     </w:p>
-    <w:p>
+    <w:p ns2:paraId="7D6C59CE" ns2:textId="77777777">
       <w:pPr>
         <w:numPr>
           <w:ilvl w:val="0"/>
@@ -1211,18 +1211,18 @@
           <w:kern w:val="0"/>
           <w:sz w:val="24"/>
           <w:szCs w:val="24"/>
-          <w14:ligatures w14:val="none"/>
-        </w:rPr>
-      </w:pPr>
-      <w:r>
-        <w:rPr>
-          <w:rFonts w:ascii="Times New Roman" w:eastAsia="Times New Roman" w:hAnsi="Times New Roman" w:cs="Times New Roman"/>
-          <w:b/>
-          <w:bCs/>
-          <w:kern w:val="0"/>
-          <w:sz w:val="24"/>
-          <w:szCs w:val="24"/>
-          <w14:ligatures w14:val="none"/>
+          <ns2:ligatures ns2:val="none"/>
+        </w:rPr>
+      </w:pPr>
+      <w:r>
+        <w:rPr>
+          <w:rFonts w:ascii="Times New Roman" w:eastAsia="Times New Roman" w:hAnsi="Times New Roman" w:cs="Times New Roman"/>
+          <w:b/>
+          <w:bCs/>
+          <w:kern w:val="0"/>
+          <w:sz w:val="24"/>
+          <w:szCs w:val="24"/>
+          <ns2:ligatures ns2:val="none"/>
         </w:rPr>
         <w:t>$5,000 protection</w:t>
       </w:r>
@@ -1232,54 +1232,54 @@
           <w:kern w:val="0"/>
           <w:sz w:val="24"/>
           <w:szCs w:val="24"/>
-          <w14:ligatures w14:val="none"/>
+          <ns2:ligatures ns2:val="none"/>
         </w:rPr>
         <w:t xml:space="preserve"> – $21/month</w:t>
       </w:r>
     </w:p>
-    <w:p>
-      <w:pPr>
-        <w:rPr>
-          <w:rFonts w:ascii="Times New Roman" w:eastAsia="Times New Roman" w:hAnsi="Times New Roman" w:cs="Times New Roman"/>
-          <w:kern w:val="0"/>
-          <w:sz w:val="24"/>
-          <w:szCs w:val="24"/>
-          <w14:ligatures w14:val="none"/>
-        </w:rPr>
-      </w:pPr>
-      <w:r>
-        <w:rPr>
-          <w:rFonts w:ascii="Times New Roman" w:eastAsia="Times New Roman" w:hAnsi="Times New Roman" w:cs="Times New Roman"/>
-          <w:kern w:val="0"/>
-          <w:sz w:val="24"/>
-          <w:szCs w:val="24"/>
-          <w14:ligatures w14:val="none"/>
-        </w:rPr>
-        <w:pict w14:anchorId="52E94E67">
-          <v:rect id="_x0000_i1027" style="width:0;height:1.5pt" o:hralign="center" o:hrstd="t" o:hr="t" fillcolor="#a0a0a0" stroked="f"/>
+    <w:p ns2:paraId="40BE4007" ns2:textId="77777777">
+      <w:pPr>
+        <w:rPr>
+          <w:rFonts w:ascii="Times New Roman" w:eastAsia="Times New Roman" w:hAnsi="Times New Roman" w:cs="Times New Roman"/>
+          <w:kern w:val="0"/>
+          <w:sz w:val="24"/>
+          <w:szCs w:val="24"/>
+          <ns2:ligatures ns2:val="none"/>
+        </w:rPr>
+      </w:pPr>
+      <w:r>
+        <w:rPr>
+          <w:rFonts w:ascii="Times New Roman" w:eastAsia="Times New Roman" w:hAnsi="Times New Roman" w:cs="Times New Roman"/>
+          <w:kern w:val="0"/>
+          <w:sz w:val="24"/>
+          <w:szCs w:val="24"/>
+          <ns2:ligatures ns2:val="none"/>
+        </w:rPr>
+        <w:pict ns2:anchorId="52E94E67">
+          <ns3:rect id="_x0000_i1027" style="width:0;height:1.5pt" ns4:hralign="center" ns4:hrstd="t" ns4:hr="t" fillcolor="#a0a0a0" stroked="f"/>
         </w:pict>
       </w:r>
     </w:p>
-    <w:p>
-      <w:pPr>
-        <w:spacing w:before="100" w:beforeAutospacing="1" w:after="100" w:afterAutospacing="1"/>
-        <w:rPr>
-          <w:rFonts w:ascii="Times New Roman" w:eastAsia="Times New Roman" w:hAnsi="Times New Roman" w:cs="Times New Roman"/>
-          <w:kern w:val="0"/>
-          <w:sz w:val="24"/>
-          <w:szCs w:val="24"/>
-          <w14:ligatures w14:val="none"/>
-        </w:rPr>
-      </w:pPr>
-      <w:r>
-        <w:rPr>
-          <w:rFonts w:ascii="Times New Roman" w:eastAsia="Times New Roman" w:hAnsi="Times New Roman" w:cs="Times New Roman"/>
-          <w:b/>
-          <w:bCs/>
-          <w:kern w:val="0"/>
-          <w:sz w:val="24"/>
-          <w:szCs w:val="24"/>
-          <w14:ligatures w14:val="none"/>
+    <w:p ns2:paraId="5DAB20B0" ns2:textId="58F30320">
+      <w:pPr>
+        <w:spacing w:before="100" w:beforeAutospacing="1" w:after="100" w:afterAutospacing="1"/>
+        <w:rPr>
+          <w:rFonts w:ascii="Times New Roman" w:eastAsia="Times New Roman" w:hAnsi="Times New Roman" w:cs="Times New Roman"/>
+          <w:kern w:val="0"/>
+          <w:sz w:val="24"/>
+          <w:szCs w:val="24"/>
+          <ns2:ligatures ns2:val="none"/>
+        </w:rPr>
+      </w:pPr>
+      <w:r>
+        <w:rPr>
+          <w:rFonts w:ascii="Times New Roman" w:eastAsia="Times New Roman" w:hAnsi="Times New Roman" w:cs="Times New Roman"/>
+          <w:b/>
+          <w:bCs/>
+          <w:kern w:val="0"/>
+          <w:sz w:val="24"/>
+          <w:szCs w:val="24"/>
+          <ns2:ligatures ns2:val="none"/>
         </w:rPr>
         <w:t xml:space="preserve">Ready to Switch to </w:t>
       </w:r>
@@ -1291,46 +1291,46 @@
           <w:kern w:val="0"/>
           <w:sz w:val="24"/>
           <w:szCs w:val="24"/>
-          <w14:ligatures w14:val="none"/>
-        </w:rPr>
-        <w:t>PROTEGO</w:t>
-      </w:r>
-      <w:r>
-        <w:rPr>
-          <w:rFonts w:ascii="Times New Roman" w:eastAsia="Times New Roman" w:hAnsi="Times New Roman" w:cs="Times New Roman"/>
-          <w:b/>
-          <w:bCs/>
-          <w:kern w:val="0"/>
-          <w:sz w:val="24"/>
-          <w:szCs w:val="24"/>
-          <w14:ligatures w14:val="none"/>
-        </w:rPr>
-        <w:t xml:space="preserve"> Protection?</w:t>
-      </w:r>
-    </w:p>
-    <w:p>
-      <w:pPr>
-        <w:spacing w:before="100" w:beforeAutospacing="1" w:after="100" w:afterAutospacing="1"/>
-        <w:rPr>
-          <w:rFonts w:ascii="Times New Roman" w:eastAsia="Times New Roman" w:hAnsi="Times New Roman" w:cs="Times New Roman"/>
-          <w:kern w:val="0"/>
-          <w:sz w:val="24"/>
-          <w:szCs w:val="24"/>
-          <w14:ligatures w14:val="none"/>
-        </w:rPr>
-      </w:pPr>
-      <w:r>
-        <w:rPr>
-          <w:rFonts w:ascii="Times New Roman" w:eastAsia="Times New Roman" w:hAnsi="Times New Roman" w:cs="Times New Roman"/>
-          <w:kern w:val="0"/>
-          <w:sz w:val="24"/>
-          <w:szCs w:val="24"/>
-          <w14:ligatures w14:val="none"/>
+          <ns2:ligatures ns2:val="none"/>
+        </w:rPr>
+        <w:t>TPP Secure Protection</w:t>
+      </w:r>
+      <w:r>
+        <w:rPr>
+          <w:rFonts w:ascii="Times New Roman" w:eastAsia="Times New Roman" w:hAnsi="Times New Roman" w:cs="Times New Roman"/>
+          <w:b/>
+          <w:bCs/>
+          <w:kern w:val="0"/>
+          <w:sz w:val="24"/>
+          <w:szCs w:val="24"/>
+          <ns2:ligatures ns2:val="none"/>
+        </w:rPr>
+        <w:t xml:space="preserve">?</w:t>
+      </w:r>
+    </w:p>
+    <w:p ns2:paraId="0911D91B" ns2:textId="77777777">
+      <w:pPr>
+        <w:spacing w:before="100" w:beforeAutospacing="1" w:after="100" w:afterAutospacing="1"/>
+        <w:rPr>
+          <w:rFonts w:ascii="Times New Roman" w:eastAsia="Times New Roman" w:hAnsi="Times New Roman" w:cs="Times New Roman"/>
+          <w:kern w:val="0"/>
+          <w:sz w:val="24"/>
+          <w:szCs w:val="24"/>
+          <ns2:ligatures ns2:val="none"/>
+        </w:rPr>
+      </w:pPr>
+      <w:r>
+        <w:rPr>
+          <w:rFonts w:ascii="Times New Roman" w:eastAsia="Times New Roman" w:hAnsi="Times New Roman" w:cs="Times New Roman"/>
+          <w:kern w:val="0"/>
+          <w:sz w:val="24"/>
+          <w:szCs w:val="24"/>
+          <ns2:ligatures ns2:val="none"/>
         </w:rPr>
         <w:t>Contact us to confirm enrollment:</w:t>
       </w:r>
     </w:p>
-    <w:p>
+    <w:p ns2:paraId="0CC29A22" ns2:textId="77777777">
       <w:pPr>
         <w:numPr>
           <w:ilvl w:val="0"/>
@@ -1342,18 +1342,18 @@
           <w:kern w:val="0"/>
           <w:sz w:val="24"/>
           <w:szCs w:val="24"/>
-          <w14:ligatures w14:val="none"/>
-        </w:rPr>
-      </w:pPr>
-      <w:r>
-        <w:rPr>
-          <w:rFonts w:ascii="Times New Roman" w:eastAsia="Times New Roman" w:hAnsi="Times New Roman" w:cs="Times New Roman"/>
-          <w:b/>
-          <w:bCs/>
-          <w:kern w:val="0"/>
-          <w:sz w:val="24"/>
-          <w:szCs w:val="24"/>
-          <w14:ligatures w14:val="none"/>
+          <ns2:ligatures ns2:val="none"/>
+        </w:rPr>
+      </w:pPr>
+      <w:r>
+        <w:rPr>
+          <w:rFonts w:ascii="Times New Roman" w:eastAsia="Times New Roman" w:hAnsi="Times New Roman" w:cs="Times New Roman"/>
+          <w:b/>
+          <w:bCs/>
+          <w:kern w:val="0"/>
+          <w:sz w:val="24"/>
+          <w:szCs w:val="24"/>
+          <ns2:ligatures ns2:val="none"/>
         </w:rPr>
         <w:t>Call:</w:t>
       </w:r>
@@ -1363,12 +1363,12 @@
           <w:kern w:val="0"/>
           <w:sz w:val="24"/>
           <w:szCs w:val="24"/>
-          <w14:ligatures w14:val="none"/>
+          <ns2:ligatures ns2:val="none"/>
         </w:rPr>
         <w:t xml:space="preserve"> [Facility Name] and speak with your manager</w:t>
       </w:r>
     </w:p>
-    <w:p>
+    <w:p ns2:paraId="209FBC1B" ns2:textId="77777777">
       <w:pPr>
         <w:numPr>
           <w:ilvl w:val="0"/>
@@ -1380,18 +1380,18 @@
           <w:kern w:val="0"/>
           <w:sz w:val="24"/>
           <w:szCs w:val="24"/>
-          <w14:ligatures w14:val="none"/>
-        </w:rPr>
-      </w:pPr>
-      <w:r>
-        <w:rPr>
-          <w:rFonts w:ascii="Times New Roman" w:eastAsia="Times New Roman" w:hAnsi="Times New Roman" w:cs="Times New Roman"/>
-          <w:b/>
-          <w:bCs/>
-          <w:kern w:val="0"/>
-          <w:sz w:val="24"/>
-          <w:szCs w:val="24"/>
-          <w14:ligatures w14:val="none"/>
+          <ns2:ligatures ns2:val="none"/>
+        </w:rPr>
+      </w:pPr>
+      <w:r>
+        <w:rPr>
+          <w:rFonts w:ascii="Times New Roman" w:eastAsia="Times New Roman" w:hAnsi="Times New Roman" w:cs="Times New Roman"/>
+          <w:b/>
+          <w:bCs/>
+          <w:kern w:val="0"/>
+          <w:sz w:val="24"/>
+          <w:szCs w:val="24"/>
+          <ns2:ligatures ns2:val="none"/>
         </w:rPr>
         <w:t>Email:</w:t>
       </w:r>
@@ -1401,103 +1401,103 @@
           <w:kern w:val="0"/>
           <w:sz w:val="24"/>
           <w:szCs w:val="24"/>
-          <w14:ligatures w14:val="none"/>
+          <ns2:ligatures ns2:val="none"/>
         </w:rPr>
         <w:t xml:space="preserve"> support@myownpolicy.com</w:t>
       </w:r>
     </w:p>
-    <w:p>
-      <w:pPr>
-        <w:spacing w:before="100" w:beforeAutospacing="1" w:after="100" w:afterAutospacing="1"/>
-        <w:rPr>
-          <w:rFonts w:ascii="Times New Roman" w:eastAsia="Times New Roman" w:hAnsi="Times New Roman" w:cs="Times New Roman"/>
-          <w:kern w:val="0"/>
-          <w:sz w:val="24"/>
-          <w:szCs w:val="24"/>
-          <w14:ligatures w14:val="none"/>
-        </w:rPr>
-      </w:pPr>
-      <w:r>
-        <w:rPr>
-          <w:rFonts w:ascii="Times New Roman" w:eastAsia="Times New Roman" w:hAnsi="Times New Roman" w:cs="Times New Roman"/>
-          <w:kern w:val="0"/>
-          <w:sz w:val="24"/>
-          <w:szCs w:val="24"/>
-          <w14:ligatures w14:val="none"/>
+    <w:p ns2:paraId="2B0022AA" ns2:textId="77777777">
+      <w:pPr>
+        <w:spacing w:before="100" w:beforeAutospacing="1" w:after="100" w:afterAutospacing="1"/>
+        <w:rPr>
+          <w:rFonts w:ascii="Times New Roman" w:eastAsia="Times New Roman" w:hAnsi="Times New Roman" w:cs="Times New Roman"/>
+          <w:kern w:val="0"/>
+          <w:sz w:val="24"/>
+          <w:szCs w:val="24"/>
+          <ns2:ligatures ns2:val="none"/>
+        </w:rPr>
+      </w:pPr>
+      <w:r>
+        <w:rPr>
+          <w:rFonts w:ascii="Times New Roman" w:eastAsia="Times New Roman" w:hAnsi="Times New Roman" w:cs="Times New Roman"/>
+          <w:kern w:val="0"/>
+          <w:sz w:val="24"/>
+          <w:szCs w:val="24"/>
+          <ns2:ligatures ns2:val="none"/>
         </w:rPr>
         <w:t>We'll handle the rest and ensure uninterrupted coverage starting when your current insurance expires.</w:t>
       </w:r>
     </w:p>
-    <w:p>
-      <w:pPr>
-        <w:rPr>
-          <w:rFonts w:ascii="Times New Roman" w:eastAsia="Times New Roman" w:hAnsi="Times New Roman" w:cs="Times New Roman"/>
-          <w:kern w:val="0"/>
-          <w:sz w:val="24"/>
-          <w:szCs w:val="24"/>
-          <w14:ligatures w14:val="none"/>
-        </w:rPr>
-      </w:pPr>
-      <w:r>
-        <w:rPr>
-          <w:rFonts w:ascii="Times New Roman" w:eastAsia="Times New Roman" w:hAnsi="Times New Roman" w:cs="Times New Roman"/>
-          <w:kern w:val="0"/>
-          <w:sz w:val="24"/>
-          <w:szCs w:val="24"/>
-          <w14:ligatures w14:val="none"/>
-        </w:rPr>
-        <w:pict w14:anchorId="5B71A001">
-          <v:rect id="_x0000_i1028" style="width:0;height:1.5pt" o:hralign="center" o:hrstd="t" o:hr="t" fillcolor="#a0a0a0" stroked="f"/>
+    <w:p ns2:paraId="3F3E98D8" ns2:textId="77777777">
+      <w:pPr>
+        <w:rPr>
+          <w:rFonts w:ascii="Times New Roman" w:eastAsia="Times New Roman" w:hAnsi="Times New Roman" w:cs="Times New Roman"/>
+          <w:kern w:val="0"/>
+          <w:sz w:val="24"/>
+          <w:szCs w:val="24"/>
+          <ns2:ligatures ns2:val="none"/>
+        </w:rPr>
+      </w:pPr>
+      <w:r>
+        <w:rPr>
+          <w:rFonts w:ascii="Times New Roman" w:eastAsia="Times New Roman" w:hAnsi="Times New Roman" w:cs="Times New Roman"/>
+          <w:kern w:val="0"/>
+          <w:sz w:val="24"/>
+          <w:szCs w:val="24"/>
+          <ns2:ligatures ns2:val="none"/>
+        </w:rPr>
+        <w:pict ns2:anchorId="5B71A001">
+          <ns3:rect id="_x0000_i1028" style="width:0;height:1.5pt" ns4:hralign="center" ns4:hrstd="t" ns4:hr="t" fillcolor="#a0a0a0" stroked="f"/>
         </w:pict>
       </w:r>
     </w:p>
-    <w:p>
-      <w:pPr>
-        <w:spacing w:before="100" w:beforeAutospacing="1" w:after="100" w:afterAutospacing="1"/>
-        <w:rPr>
-          <w:rFonts w:ascii="Times New Roman" w:eastAsia="Times New Roman" w:hAnsi="Times New Roman" w:cs="Times New Roman"/>
-          <w:kern w:val="0"/>
-          <w:sz w:val="24"/>
-          <w:szCs w:val="24"/>
-          <w14:ligatures w14:val="none"/>
-        </w:rPr>
-      </w:pPr>
-      <w:r>
-        <w:rPr>
-          <w:rFonts w:ascii="Times New Roman" w:eastAsia="Times New Roman" w:hAnsi="Times New Roman" w:cs="Times New Roman"/>
-          <w:b/>
-          <w:bCs/>
-          <w:kern w:val="0"/>
-          <w:sz w:val="24"/>
-          <w:szCs w:val="24"/>
-          <w14:ligatures w14:val="none"/>
+    <w:p ns2:paraId="5F7A5C13" ns2:textId="77777777">
+      <w:pPr>
+        <w:spacing w:before="100" w:beforeAutospacing="1" w:after="100" w:afterAutospacing="1"/>
+        <w:rPr>
+          <w:rFonts w:ascii="Times New Roman" w:eastAsia="Times New Roman" w:hAnsi="Times New Roman" w:cs="Times New Roman"/>
+          <w:kern w:val="0"/>
+          <w:sz w:val="24"/>
+          <w:szCs w:val="24"/>
+          <ns2:ligatures ns2:val="none"/>
+        </w:rPr>
+      </w:pPr>
+      <w:r>
+        <w:rPr>
+          <w:rFonts w:ascii="Times New Roman" w:eastAsia="Times New Roman" w:hAnsi="Times New Roman" w:cs="Times New Roman"/>
+          <w:b/>
+          <w:bCs/>
+          <w:kern w:val="0"/>
+          <w:sz w:val="24"/>
+          <w:szCs w:val="24"/>
+          <ns2:ligatures ns2:val="none"/>
         </w:rPr>
         <w:t>Prefer to Keep Your Current Insurance?</w:t>
       </w:r>
     </w:p>
-    <w:p>
-      <w:pPr>
-        <w:spacing w:before="100" w:beforeAutospacing="1" w:after="100" w:afterAutospacing="1"/>
-        <w:rPr>
-          <w:rFonts w:ascii="Times New Roman" w:eastAsia="Times New Roman" w:hAnsi="Times New Roman" w:cs="Times New Roman"/>
-          <w:kern w:val="0"/>
-          <w:sz w:val="24"/>
-          <w:szCs w:val="24"/>
-          <w14:ligatures w14:val="none"/>
-        </w:rPr>
-      </w:pPr>
-      <w:r>
-        <w:rPr>
-          <w:rFonts w:ascii="Times New Roman" w:eastAsia="Times New Roman" w:hAnsi="Times New Roman" w:cs="Times New Roman"/>
-          <w:kern w:val="0"/>
-          <w:sz w:val="24"/>
-          <w:szCs w:val="24"/>
-          <w14:ligatures w14:val="none"/>
+    <w:p ns2:paraId="742B3B49" ns2:textId="77777777">
+      <w:pPr>
+        <w:spacing w:before="100" w:beforeAutospacing="1" w:after="100" w:afterAutospacing="1"/>
+        <w:rPr>
+          <w:rFonts w:ascii="Times New Roman" w:eastAsia="Times New Roman" w:hAnsi="Times New Roman" w:cs="Times New Roman"/>
+          <w:kern w:val="0"/>
+          <w:sz w:val="24"/>
+          <w:szCs w:val="24"/>
+          <ns2:ligatures ns2:val="none"/>
+        </w:rPr>
+      </w:pPr>
+      <w:r>
+        <w:rPr>
+          <w:rFonts w:ascii="Times New Roman" w:eastAsia="Times New Roman" w:hAnsi="Times New Roman" w:cs="Times New Roman"/>
+          <w:kern w:val="0"/>
+          <w:sz w:val="24"/>
+          <w:szCs w:val="24"/>
+          <ns2:ligatures ns2:val="none"/>
         </w:rPr>
         <w:t>If you're renewing your homeowner's or renter's policy and want to continue using it for storage coverage, simply update your documentation:</w:t>
       </w:r>
     </w:p>
-    <w:p>
+    <w:p ns2:paraId="398E5F6C" ns2:textId="77777777">
       <w:pPr>
         <w:numPr>
           <w:ilvl w:val="0"/>
@@ -1509,18 +1509,18 @@
           <w:kern w:val="0"/>
           <w:sz w:val="24"/>
           <w:szCs w:val="24"/>
-          <w14:ligatures w14:val="none"/>
-        </w:rPr>
-      </w:pPr>
-      <w:r>
-        <w:rPr>
-          <w:rFonts w:ascii="Times New Roman" w:eastAsia="Times New Roman" w:hAnsi="Times New Roman" w:cs="Times New Roman"/>
-          <w:b/>
-          <w:bCs/>
-          <w:kern w:val="0"/>
-          <w:sz w:val="24"/>
-          <w:szCs w:val="24"/>
-          <w14:ligatures w14:val="none"/>
+          <ns2:ligatures ns2:val="none"/>
+        </w:rPr>
+      </w:pPr>
+      <w:r>
+        <w:rPr>
+          <w:rFonts w:ascii="Times New Roman" w:eastAsia="Times New Roman" w:hAnsi="Times New Roman" w:cs="Times New Roman"/>
+          <w:b/>
+          <w:bCs/>
+          <w:kern w:val="0"/>
+          <w:sz w:val="24"/>
+          <w:szCs w:val="24"/>
+          <ns2:ligatures ns2:val="none"/>
         </w:rPr>
         <w:t>Visit MyOwnPolicy.com</w:t>
       </w:r>
@@ -1530,12 +1530,12 @@
           <w:kern w:val="0"/>
           <w:sz w:val="24"/>
           <w:szCs w:val="24"/>
-          <w14:ligatures w14:val="none"/>
+          <ns2:ligatures ns2:val="none"/>
         </w:rPr>
         <w:t xml:space="preserve"> (or type https://myownpolicy.com into your browser)</w:t>
       </w:r>
     </w:p>
-    <w:p>
+    <w:p ns2:paraId="25EF8E79" ns2:textId="77777777">
       <w:pPr>
         <w:numPr>
           <w:ilvl w:val="0"/>
@@ -1547,18 +1547,18 @@
           <w:kern w:val="0"/>
           <w:sz w:val="24"/>
           <w:szCs w:val="24"/>
-          <w14:ligatures w14:val="none"/>
-        </w:rPr>
-      </w:pPr>
-      <w:r>
-        <w:rPr>
-          <w:rFonts w:ascii="Times New Roman" w:eastAsia="Times New Roman" w:hAnsi="Times New Roman" w:cs="Times New Roman"/>
-          <w:b/>
-          <w:bCs/>
-          <w:kern w:val="0"/>
-          <w:sz w:val="24"/>
-          <w:szCs w:val="24"/>
-          <w14:ligatures w14:val="none"/>
+          <ns2:ligatures ns2:val="none"/>
+        </w:rPr>
+      </w:pPr>
+      <w:r>
+        <w:rPr>
+          <w:rFonts w:ascii="Times New Roman" w:eastAsia="Times New Roman" w:hAnsi="Times New Roman" w:cs="Times New Roman"/>
+          <w:b/>
+          <w:bCs/>
+          <w:kern w:val="0"/>
+          <w:sz w:val="24"/>
+          <w:szCs w:val="24"/>
+          <ns2:ligatures ns2:val="none"/>
         </w:rPr>
         <w:t>Upload</w:t>
       </w:r>
@@ -1568,12 +1568,12 @@
           <w:kern w:val="0"/>
           <w:sz w:val="24"/>
           <w:szCs w:val="24"/>
-          <w14:ligatures w14:val="none"/>
+          <ns2:ligatures ns2:val="none"/>
         </w:rPr>
         <w:t xml:space="preserve"> your updated insurance declaration page with the new expiration date</w:t>
       </w:r>
     </w:p>
-    <w:p>
+    <w:p ns2:paraId="7239826F" ns2:textId="77777777">
       <w:pPr>
         <w:numPr>
           <w:ilvl w:val="0"/>
@@ -1585,18 +1585,18 @@
           <w:kern w:val="0"/>
           <w:sz w:val="24"/>
           <w:szCs w:val="24"/>
-          <w14:ligatures w14:val="none"/>
-        </w:rPr>
-      </w:pPr>
-      <w:r>
-        <w:rPr>
-          <w:rFonts w:ascii="Times New Roman" w:eastAsia="Times New Roman" w:hAnsi="Times New Roman" w:cs="Times New Roman"/>
-          <w:b/>
-          <w:bCs/>
-          <w:kern w:val="0"/>
-          <w:sz w:val="24"/>
-          <w:szCs w:val="24"/>
-          <w14:ligatures w14:val="none"/>
+          <ns2:ligatures ns2:val="none"/>
+        </w:rPr>
+      </w:pPr>
+      <w:r>
+        <w:rPr>
+          <w:rFonts w:ascii="Times New Roman" w:eastAsia="Times New Roman" w:hAnsi="Times New Roman" w:cs="Times New Roman"/>
+          <w:b/>
+          <w:bCs/>
+          <w:kern w:val="0"/>
+          <w:sz w:val="24"/>
+          <w:szCs w:val="24"/>
+          <ns2:ligatures ns2:val="none"/>
         </w:rPr>
         <w:t>Confirm</w:t>
       </w:r>
@@ -1606,12 +1606,12 @@
           <w:kern w:val="0"/>
           <w:sz w:val="24"/>
           <w:szCs w:val="24"/>
-          <w14:ligatures w14:val="none"/>
+          <ns2:ligatures ns2:val="none"/>
         </w:rPr>
         <w:t xml:space="preserve"> it shows "off-premises" or storage coverage</w:t>
       </w:r>
     </w:p>
-    <w:p>
+    <w:p ns2:paraId="234DCB4C" ns2:textId="77777777">
       <w:pPr>
         <w:numPr>
           <w:ilvl w:val="0"/>
@@ -1623,18 +1623,18 @@
           <w:kern w:val="0"/>
           <w:sz w:val="24"/>
           <w:szCs w:val="24"/>
-          <w14:ligatures w14:val="none"/>
-        </w:rPr>
-      </w:pPr>
-      <w:r>
-        <w:rPr>
-          <w:rFonts w:ascii="Times New Roman" w:eastAsia="Times New Roman" w:hAnsi="Times New Roman" w:cs="Times New Roman"/>
-          <w:b/>
-          <w:bCs/>
-          <w:kern w:val="0"/>
-          <w:sz w:val="24"/>
-          <w:szCs w:val="24"/>
-          <w14:ligatures w14:val="none"/>
+          <ns2:ligatures ns2:val="none"/>
+        </w:rPr>
+      </w:pPr>
+      <w:r>
+        <w:rPr>
+          <w:rFonts w:ascii="Times New Roman" w:eastAsia="Times New Roman" w:hAnsi="Times New Roman" w:cs="Times New Roman"/>
+          <w:b/>
+          <w:bCs/>
+          <w:kern w:val="0"/>
+          <w:sz w:val="24"/>
+          <w:szCs w:val="24"/>
+          <ns2:ligatures ns2:val="none"/>
         </w:rPr>
         <w:t>Submit within 10 days</w:t>
       </w:r>
@@ -1644,76 +1644,76 @@
           <w:kern w:val="0"/>
           <w:sz w:val="24"/>
           <w:szCs w:val="24"/>
-          <w14:ligatures w14:val="none"/>
+          <ns2:ligatures ns2:val="none"/>
         </w:rPr>
         <w:t xml:space="preserve"> to maintain your current arrangement</w:t>
       </w:r>
     </w:p>
-    <w:p>
-      <w:pPr>
-        <w:rPr>
-          <w:rFonts w:ascii="Times New Roman" w:eastAsia="Times New Roman" w:hAnsi="Times New Roman" w:cs="Times New Roman"/>
-          <w:kern w:val="0"/>
-          <w:sz w:val="24"/>
-          <w:szCs w:val="24"/>
-          <w14:ligatures w14:val="none"/>
-        </w:rPr>
-      </w:pPr>
-      <w:r>
-        <w:rPr>
-          <w:rFonts w:ascii="Times New Roman" w:eastAsia="Times New Roman" w:hAnsi="Times New Roman" w:cs="Times New Roman"/>
-          <w:kern w:val="0"/>
-          <w:sz w:val="24"/>
-          <w:szCs w:val="24"/>
-          <w14:ligatures w14:val="none"/>
-        </w:rPr>
-        <w:pict w14:anchorId="3114375B">
-          <v:rect id="_x0000_i1029" style="width:0;height:1.5pt" o:hralign="center" o:hrstd="t" o:hr="t" fillcolor="#a0a0a0" stroked="f"/>
+    <w:p ns2:paraId="7A7CD688" ns2:textId="77777777">
+      <w:pPr>
+        <w:rPr>
+          <w:rFonts w:ascii="Times New Roman" w:eastAsia="Times New Roman" w:hAnsi="Times New Roman" w:cs="Times New Roman"/>
+          <w:kern w:val="0"/>
+          <w:sz w:val="24"/>
+          <w:szCs w:val="24"/>
+          <ns2:ligatures ns2:val="none"/>
+        </w:rPr>
+      </w:pPr>
+      <w:r>
+        <w:rPr>
+          <w:rFonts w:ascii="Times New Roman" w:eastAsia="Times New Roman" w:hAnsi="Times New Roman" w:cs="Times New Roman"/>
+          <w:kern w:val="0"/>
+          <w:sz w:val="24"/>
+          <w:szCs w:val="24"/>
+          <ns2:ligatures ns2:val="none"/>
+        </w:rPr>
+        <w:pict ns2:anchorId="3114375B">
+          <ns3:rect id="_x0000_i1029" style="width:0;height:1.5pt" ns4:hralign="center" ns4:hrstd="t" ns4:hr="t" fillcolor="#a0a0a0" stroked="f"/>
         </w:pict>
       </w:r>
     </w:p>
-    <w:p>
-      <w:pPr>
-        <w:spacing w:before="100" w:beforeAutospacing="1" w:after="100" w:afterAutospacing="1"/>
-        <w:rPr>
-          <w:rFonts w:ascii="Times New Roman" w:eastAsia="Times New Roman" w:hAnsi="Times New Roman" w:cs="Times New Roman"/>
-          <w:kern w:val="0"/>
-          <w:sz w:val="24"/>
-          <w:szCs w:val="24"/>
-          <w14:ligatures w14:val="none"/>
-        </w:rPr>
-      </w:pPr>
-      <w:r>
-        <w:rPr>
-          <w:rFonts w:ascii="Times New Roman" w:eastAsia="Times New Roman" w:hAnsi="Times New Roman" w:cs="Times New Roman"/>
-          <w:b/>
-          <w:bCs/>
-          <w:kern w:val="0"/>
-          <w:sz w:val="24"/>
-          <w:szCs w:val="24"/>
-          <w14:ligatures w14:val="none"/>
+    <w:p ns2:paraId="223F1AE4" ns2:textId="77777777">
+      <w:pPr>
+        <w:spacing w:before="100" w:beforeAutospacing="1" w:after="100" w:afterAutospacing="1"/>
+        <w:rPr>
+          <w:rFonts w:ascii="Times New Roman" w:eastAsia="Times New Roman" w:hAnsi="Times New Roman" w:cs="Times New Roman"/>
+          <w:kern w:val="0"/>
+          <w:sz w:val="24"/>
+          <w:szCs w:val="24"/>
+          <ns2:ligatures ns2:val="none"/>
+        </w:rPr>
+      </w:pPr>
+      <w:r>
+        <w:rPr>
+          <w:rFonts w:ascii="Times New Roman" w:eastAsia="Times New Roman" w:hAnsi="Times New Roman" w:cs="Times New Roman"/>
+          <w:b/>
+          <w:bCs/>
+          <w:kern w:val="0"/>
+          <w:sz w:val="24"/>
+          <w:szCs w:val="24"/>
+          <ns2:ligatures ns2:val="none"/>
         </w:rPr>
         <w:t>Important: 10-Day Deadline</w:t>
       </w:r>
     </w:p>
-    <w:p>
-      <w:pPr>
-        <w:spacing w:before="100" w:beforeAutospacing="1" w:after="100" w:afterAutospacing="1"/>
-        <w:rPr>
-          <w:rFonts w:ascii="Times New Roman" w:eastAsia="Times New Roman" w:hAnsi="Times New Roman" w:cs="Times New Roman"/>
-          <w:kern w:val="0"/>
-          <w:sz w:val="24"/>
-          <w:szCs w:val="24"/>
-          <w14:ligatures w14:val="none"/>
-        </w:rPr>
-      </w:pPr>
-      <w:r>
-        <w:rPr>
-          <w:rFonts w:ascii="Times New Roman" w:eastAsia="Times New Roman" w:hAnsi="Times New Roman" w:cs="Times New Roman"/>
-          <w:kern w:val="0"/>
-          <w:sz w:val="24"/>
-          <w:szCs w:val="24"/>
-          <w14:ligatures w14:val="none"/>
+    <w:p ns2:paraId="69F75D7D" ns2:textId="0FBE883A">
+      <w:pPr>
+        <w:spacing w:before="100" w:beforeAutospacing="1" w:after="100" w:afterAutospacing="1"/>
+        <w:rPr>
+          <w:rFonts w:ascii="Times New Roman" w:eastAsia="Times New Roman" w:hAnsi="Times New Roman" w:cs="Times New Roman"/>
+          <w:kern w:val="0"/>
+          <w:sz w:val="24"/>
+          <w:szCs w:val="24"/>
+          <ns2:ligatures ns2:val="none"/>
+        </w:rPr>
+      </w:pPr>
+      <w:r>
+        <w:rPr>
+          <w:rFonts w:ascii="Times New Roman" w:eastAsia="Times New Roman" w:hAnsi="Times New Roman" w:cs="Times New Roman"/>
+          <w:kern w:val="0"/>
+          <w:sz w:val="24"/>
+          <w:szCs w:val="24"/>
+          <ns2:ligatures ns2:val="none"/>
         </w:rPr>
         <w:t xml:space="preserve">You must </w:t>
       </w:r>
@@ -1724,7 +1724,7 @@
           <w:kern w:val="0"/>
           <w:sz w:val="24"/>
           <w:szCs w:val="24"/>
-          <w14:ligatures w14:val="none"/>
+          <ns2:ligatures ns2:val="none"/>
         </w:rPr>
         <w:t>take action</w:t>
       </w:r>
@@ -1735,7 +1735,7 @@
           <w:kern w:val="0"/>
           <w:sz w:val="24"/>
           <w:szCs w:val="24"/>
-          <w14:ligatures w14:val="none"/>
+          <ns2:ligatures ns2:val="none"/>
         </w:rPr>
         <w:t xml:space="preserve"> within </w:t>
       </w:r>
@@ -1747,7 +1747,7 @@
           <w:kern w:val="0"/>
           <w:sz w:val="24"/>
           <w:szCs w:val="24"/>
-          <w14:ligatures w14:val="none"/>
+          <ns2:ligatures ns2:val="none"/>
         </w:rPr>
         <w:t>10 days</w:t>
       </w:r>
@@ -1757,7 +1757,7 @@
           <w:kern w:val="0"/>
           <w:sz w:val="24"/>
           <w:szCs w:val="24"/>
-          <w14:ligatures w14:val="none"/>
+          <ns2:ligatures ns2:val="none"/>
         </w:rPr>
         <w:t xml:space="preserve"> to avoid automatic enrollment in </w:t>
       </w:r>
@@ -1767,41 +1767,41 @@
           <w:kern w:val="0"/>
           <w:sz w:val="24"/>
           <w:szCs w:val="24"/>
-          <w14:ligatures w14:val="none"/>
-        </w:rPr>
-        <w:t>PROTEGO</w:t>
-      </w:r>
-      <w:r>
-        <w:rPr>
-          <w:rFonts w:ascii="Times New Roman" w:eastAsia="Times New Roman" w:hAnsi="Times New Roman" w:cs="Times New Roman"/>
-          <w:kern w:val="0"/>
-          <w:sz w:val="24"/>
-          <w:szCs w:val="24"/>
-          <w14:ligatures w14:val="none"/>
-        </w:rPr>
-        <w:t xml:space="preserve"> Protection.</w:t>
-      </w:r>
-    </w:p>
-    <w:p>
-      <w:pPr>
-        <w:spacing w:before="100" w:beforeAutospacing="1" w:after="100" w:afterAutospacing="1"/>
-        <w:rPr>
-          <w:rFonts w:ascii="Times New Roman" w:eastAsia="Times New Roman" w:hAnsi="Times New Roman" w:cs="Times New Roman"/>
-          <w:kern w:val="0"/>
-          <w:sz w:val="24"/>
-          <w:szCs w:val="24"/>
-          <w14:ligatures w14:val="none"/>
-        </w:rPr>
-      </w:pPr>
-      <w:r>
-        <w:rPr>
-          <w:rFonts w:ascii="Times New Roman" w:eastAsia="Times New Roman" w:hAnsi="Times New Roman" w:cs="Times New Roman"/>
-          <w:b/>
-          <w:bCs/>
-          <w:kern w:val="0"/>
-          <w:sz w:val="24"/>
-          <w:szCs w:val="24"/>
-          <w14:ligatures w14:val="none"/>
+          <ns2:ligatures ns2:val="none"/>
+        </w:rPr>
+        <w:t>TPP Secure Protection</w:t>
+      </w:r>
+      <w:r>
+        <w:rPr>
+          <w:rFonts w:ascii="Times New Roman" w:eastAsia="Times New Roman" w:hAnsi="Times New Roman" w:cs="Times New Roman"/>
+          <w:kern w:val="0"/>
+          <w:sz w:val="24"/>
+          <w:szCs w:val="24"/>
+          <ns2:ligatures ns2:val="none"/>
+        </w:rPr>
+        <w:t xml:space="preserve">.</w:t>
+      </w:r>
+    </w:p>
+    <w:p ns2:paraId="51CA7B3F" ns2:textId="20D944D7">
+      <w:pPr>
+        <w:spacing w:before="100" w:beforeAutospacing="1" w:after="100" w:afterAutospacing="1"/>
+        <w:rPr>
+          <w:rFonts w:ascii="Times New Roman" w:eastAsia="Times New Roman" w:hAnsi="Times New Roman" w:cs="Times New Roman"/>
+          <w:kern w:val="0"/>
+          <w:sz w:val="24"/>
+          <w:szCs w:val="24"/>
+          <ns2:ligatures ns2:val="none"/>
+        </w:rPr>
+      </w:pPr>
+      <w:r>
+        <w:rPr>
+          <w:rFonts w:ascii="Times New Roman" w:eastAsia="Times New Roman" w:hAnsi="Times New Roman" w:cs="Times New Roman"/>
+          <w:b/>
+          <w:bCs/>
+          <w:kern w:val="0"/>
+          <w:sz w:val="24"/>
+          <w:szCs w:val="24"/>
+          <ns2:ligatures ns2:val="none"/>
         </w:rPr>
         <w:t>If we don't receive updated insurance documentation within 10 days</w:t>
       </w:r>
@@ -1811,7 +1811,7 @@
           <w:kern w:val="0"/>
           <w:sz w:val="24"/>
           <w:szCs w:val="24"/>
-          <w14:ligatures w14:val="none"/>
+          <ns2:ligatures ns2:val="none"/>
         </w:rPr>
         <w:t xml:space="preserve">, you'll be automatically enrolled in </w:t>
       </w:r>
@@ -1821,69 +1821,69 @@
           <w:kern w:val="0"/>
           <w:sz w:val="24"/>
           <w:szCs w:val="24"/>
-          <w14:ligatures w14:val="none"/>
-        </w:rPr>
-        <w:t>PROTEGO</w:t>
-      </w:r>
-      <w:r>
-        <w:rPr>
-          <w:rFonts w:ascii="Times New Roman" w:eastAsia="Times New Roman" w:hAnsi="Times New Roman" w:cs="Times New Roman"/>
-          <w:kern w:val="0"/>
-          <w:sz w:val="24"/>
-          <w:szCs w:val="24"/>
-          <w14:ligatures w14:val="none"/>
-        </w:rPr>
-        <w:t xml:space="preserve"> Protection at $12/month to ensure your belongings remain covered and your lease stays in compliance. This prevents any coverage gap and protects both you and your stored property.</w:t>
-      </w:r>
-    </w:p>
-    <w:p>
-      <w:pPr>
-        <w:rPr>
-          <w:rFonts w:ascii="Times New Roman" w:eastAsia="Times New Roman" w:hAnsi="Times New Roman" w:cs="Times New Roman"/>
-          <w:kern w:val="0"/>
-          <w:sz w:val="24"/>
-          <w:szCs w:val="24"/>
-          <w14:ligatures w14:val="none"/>
-        </w:rPr>
-      </w:pPr>
-      <w:r>
-        <w:rPr>
-          <w:rFonts w:ascii="Times New Roman" w:eastAsia="Times New Roman" w:hAnsi="Times New Roman" w:cs="Times New Roman"/>
-          <w:kern w:val="0"/>
-          <w:sz w:val="24"/>
-          <w:szCs w:val="24"/>
-          <w14:ligatures w14:val="none"/>
-        </w:rPr>
-        <w:pict w14:anchorId="6F9C7499">
-          <v:rect id="_x0000_i1030" style="width:0;height:1.5pt" o:hralign="center" o:hrstd="t" o:hr="t" fillcolor="#a0a0a0" stroked="f"/>
+          <ns2:ligatures ns2:val="none"/>
+        </w:rPr>
+        <w:t>TPP Secure Protection</w:t>
+      </w:r>
+      <w:r>
+        <w:rPr>
+          <w:rFonts w:ascii="Times New Roman" w:eastAsia="Times New Roman" w:hAnsi="Times New Roman" w:cs="Times New Roman"/>
+          <w:kern w:val="0"/>
+          <w:sz w:val="24"/>
+          <w:szCs w:val="24"/>
+          <ns2:ligatures ns2:val="none"/>
+        </w:rPr>
+        <w:t xml:space="preserve"> at $12/month to ensure your belongings remain covered and your lease stays in compliance. This prevents any coverage gap and protects both you and your stored property.</w:t>
+      </w:r>
+    </w:p>
+    <w:p ns2:paraId="5FE6FCDF" ns2:textId="77777777">
+      <w:pPr>
+        <w:rPr>
+          <w:rFonts w:ascii="Times New Roman" w:eastAsia="Times New Roman" w:hAnsi="Times New Roman" w:cs="Times New Roman"/>
+          <w:kern w:val="0"/>
+          <w:sz w:val="24"/>
+          <w:szCs w:val="24"/>
+          <ns2:ligatures ns2:val="none"/>
+        </w:rPr>
+      </w:pPr>
+      <w:r>
+        <w:rPr>
+          <w:rFonts w:ascii="Times New Roman" w:eastAsia="Times New Roman" w:hAnsi="Times New Roman" w:cs="Times New Roman"/>
+          <w:kern w:val="0"/>
+          <w:sz w:val="24"/>
+          <w:szCs w:val="24"/>
+          <ns2:ligatures ns2:val="none"/>
+        </w:rPr>
+        <w:pict ns2:anchorId="6F9C7499">
+          <ns3:rect id="_x0000_i1030" style="width:0;height:1.5pt" ns4:hralign="center" ns4:hrstd="t" ns4:hr="t" fillcolor="#a0a0a0" stroked="f"/>
         </w:pict>
       </w:r>
     </w:p>
-    <w:p>
-      <w:pPr>
-        <w:spacing w:before="100" w:beforeAutospacing="1" w:after="100" w:afterAutospacing="1"/>
-        <w:rPr>
-          <w:rFonts w:ascii="Times New Roman" w:eastAsia="Times New Roman" w:hAnsi="Times New Roman" w:cs="Times New Roman"/>
-          <w:kern w:val="0"/>
-          <w:sz w:val="24"/>
-          <w:szCs w:val="24"/>
-          <w14:ligatures w14:val="none"/>
-        </w:rPr>
-      </w:pPr>
-      <w:r>
-        <w:rPr>
-          <w:rFonts w:ascii="Times New Roman" w:eastAsia="Times New Roman" w:hAnsi="Times New Roman" w:cs="Times New Roman"/>
-          <w:b/>
-          <w:bCs/>
-          <w:kern w:val="0"/>
-          <w:sz w:val="24"/>
-          <w:szCs w:val="24"/>
-          <w14:ligatures w14:val="none"/>
+    <w:p ns2:paraId="3B7FE0D0" ns2:textId="77777777">
+      <w:pPr>
+        <w:spacing w:before="100" w:beforeAutospacing="1" w:after="100" w:afterAutospacing="1"/>
+        <w:rPr>
+          <w:rFonts w:ascii="Times New Roman" w:eastAsia="Times New Roman" w:hAnsi="Times New Roman" w:cs="Times New Roman"/>
+          <w:kern w:val="0"/>
+          <w:sz w:val="24"/>
+          <w:szCs w:val="24"/>
+          <ns2:ligatures ns2:val="none"/>
+        </w:rPr>
+      </w:pPr>
+      <w:r>
+        <w:rPr>
+          <w:rFonts w:ascii="Times New Roman" w:eastAsia="Times New Roman" w:hAnsi="Times New Roman" w:cs="Times New Roman"/>
+          <w:b/>
+          <w:bCs/>
+          <w:kern w:val="0"/>
+          <w:sz w:val="24"/>
+          <w:szCs w:val="24"/>
+          <ns2:ligatures ns2:val="none"/>
         </w:rPr>
         <w:t>Questions? We're Here to Help</w:t>
       </w:r>
     </w:p>
-    <w:p>
+    <w:p ns2:paraId="33E05152" ns2:textId="1515124D">
       <w:pPr>
         <w:numPr>
           <w:ilvl w:val="0"/>
@@ -1895,45 +1895,45 @@
           <w:kern w:val="0"/>
           <w:sz w:val="24"/>
           <w:szCs w:val="24"/>
-          <w14:ligatures w14:val="none"/>
-        </w:rPr>
-      </w:pPr>
-      <w:r>
-        <w:rPr>
-          <w:rFonts w:ascii="Times New Roman" w:eastAsia="Times New Roman" w:hAnsi="Times New Roman" w:cs="Times New Roman"/>
-          <w:b/>
-          <w:bCs/>
-          <w:kern w:val="0"/>
-          <w:sz w:val="24"/>
-          <w:szCs w:val="24"/>
-          <w14:ligatures w14:val="none"/>
-        </w:rPr>
-        <w:t>PROTEGO</w:t>
-      </w:r>
-      <w:r>
-        <w:rPr>
-          <w:rFonts w:ascii="Times New Roman" w:eastAsia="Times New Roman" w:hAnsi="Times New Roman" w:cs="Times New Roman"/>
-          <w:b/>
-          <w:bCs/>
-          <w:kern w:val="0"/>
-          <w:sz w:val="24"/>
-          <w:szCs w:val="24"/>
-          <w14:ligatures w14:val="none"/>
-        </w:rPr>
-        <w:t xml:space="preserve"> Protection enrollment:</w:t>
-      </w:r>
-      <w:r>
-        <w:rPr>
-          <w:rFonts w:ascii="Times New Roman" w:eastAsia="Times New Roman" w:hAnsi="Times New Roman" w:cs="Times New Roman"/>
-          <w:kern w:val="0"/>
-          <w:sz w:val="24"/>
-          <w:szCs w:val="24"/>
-          <w14:ligatures w14:val="none"/>
+          <ns2:ligatures ns2:val="none"/>
+        </w:rPr>
+      </w:pPr>
+      <w:r>
+        <w:rPr>
+          <w:rFonts w:ascii="Times New Roman" w:eastAsia="Times New Roman" w:hAnsi="Times New Roman" w:cs="Times New Roman"/>
+          <w:b/>
+          <w:bCs/>
+          <w:kern w:val="0"/>
+          <w:sz w:val="24"/>
+          <w:szCs w:val="24"/>
+          <ns2:ligatures ns2:val="none"/>
+        </w:rPr>
+        <w:t>TPP Secure Protection</w:t>
+      </w:r>
+      <w:r>
+        <w:rPr>
+          <w:rFonts w:ascii="Times New Roman" w:eastAsia="Times New Roman" w:hAnsi="Times New Roman" w:cs="Times New Roman"/>
+          <w:b/>
+          <w:bCs/>
+          <w:kern w:val="0"/>
+          <w:sz w:val="24"/>
+          <w:szCs w:val="24"/>
+          <ns2:ligatures ns2:val="none"/>
+        </w:rPr>
+        <w:t xml:space="preserve"> enrollment:</w:t>
+      </w:r>
+      <w:r>
+        <w:rPr>
+          <w:rFonts w:ascii="Times New Roman" w:eastAsia="Times New Roman" w:hAnsi="Times New Roman" w:cs="Times New Roman"/>
+          <w:kern w:val="0"/>
+          <w:sz w:val="24"/>
+          <w:szCs w:val="24"/>
+          <ns2:ligatures ns2:val="none"/>
         </w:rPr>
         <w:t xml:space="preserve"> Contact [Facility Name] or email support@myownpolicy.com</w:t>
       </w:r>
     </w:p>
-    <w:p>
+    <w:p ns2:paraId="3F9C94C0" ns2:textId="77777777">
       <w:pPr>
         <w:numPr>
           <w:ilvl w:val="0"/>
@@ -1945,18 +1945,18 @@
           <w:kern w:val="0"/>
           <w:sz w:val="24"/>
           <w:szCs w:val="24"/>
-          <w14:ligatures w14:val="none"/>
-        </w:rPr>
-      </w:pPr>
-      <w:r>
-        <w:rPr>
-          <w:rFonts w:ascii="Times New Roman" w:eastAsia="Times New Roman" w:hAnsi="Times New Roman" w:cs="Times New Roman"/>
-          <w:b/>
-          <w:bCs/>
-          <w:kern w:val="0"/>
-          <w:sz w:val="24"/>
-          <w:szCs w:val="24"/>
-          <w14:ligatures w14:val="none"/>
+          <ns2:ligatures ns2:val="none"/>
+        </w:rPr>
+      </w:pPr>
+      <w:r>
+        <w:rPr>
+          <w:rFonts w:ascii="Times New Roman" w:eastAsia="Times New Roman" w:hAnsi="Times New Roman" w:cs="Times New Roman"/>
+          <w:b/>
+          <w:bCs/>
+          <w:kern w:val="0"/>
+          <w:sz w:val="24"/>
+          <w:szCs w:val="24"/>
+          <ns2:ligatures ns2:val="none"/>
         </w:rPr>
         <w:t>Insurance updates:</w:t>
       </w:r>
@@ -1966,12 +1966,12 @@
           <w:kern w:val="0"/>
           <w:sz w:val="24"/>
           <w:szCs w:val="24"/>
-          <w14:ligatures w14:val="none"/>
+          <ns2:ligatures ns2:val="none"/>
         </w:rPr>
         <w:t xml:space="preserve"> Visit MyOwnPolicy.com or email support@myownpolicy.com</w:t>
       </w:r>
     </w:p>
-    <w:p>
+    <w:p ns2:paraId="75035B0B" ns2:textId="3D3297AB">
       <w:pPr>
         <w:numPr>
           <w:ilvl w:val="0"/>
@@ -1983,18 +1983,18 @@
           <w:kern w:val="0"/>
           <w:sz w:val="24"/>
           <w:szCs w:val="24"/>
-          <w14:ligatures w14:val="none"/>
-        </w:rPr>
-      </w:pPr>
-      <w:r>
-        <w:rPr>
-          <w:rFonts w:ascii="Times New Roman" w:eastAsia="Times New Roman" w:hAnsi="Times New Roman" w:cs="Times New Roman"/>
-          <w:b/>
-          <w:bCs/>
-          <w:kern w:val="0"/>
-          <w:sz w:val="24"/>
-          <w:szCs w:val="24"/>
-          <w14:ligatures w14:val="none"/>
+          <ns2:ligatures ns2:val="none"/>
+        </w:rPr>
+      </w:pPr>
+      <w:r>
+        <w:rPr>
+          <w:rFonts w:ascii="Times New Roman" w:eastAsia="Times New Roman" w:hAnsi="Times New Roman" w:cs="Times New Roman"/>
+          <w:b/>
+          <w:bCs/>
+          <w:kern w:val="0"/>
+          <w:sz w:val="24"/>
+          <w:szCs w:val="24"/>
+          <ns2:ligatures ns2:val="none"/>
         </w:rPr>
         <w:t xml:space="preserve">View </w:t>
       </w:r>
@@ -2006,29 +2006,29 @@
           <w:kern w:val="0"/>
           <w:sz w:val="24"/>
           <w:szCs w:val="24"/>
-          <w14:ligatures w14:val="none"/>
-        </w:rPr>
-        <w:t>PROTEGO</w:t>
-      </w:r>
-      <w:r>
-        <w:rPr>
-          <w:rFonts w:ascii="Times New Roman" w:eastAsia="Times New Roman" w:hAnsi="Times New Roman" w:cs="Times New Roman"/>
-          <w:b/>
-          <w:bCs/>
-          <w:kern w:val="0"/>
-          <w:sz w:val="24"/>
-          <w:szCs w:val="24"/>
-          <w14:ligatures w14:val="none"/>
-        </w:rPr>
-        <w:t xml:space="preserve"> terms:</w:t>
-      </w:r>
-      <w:r>
-        <w:rPr>
-          <w:rFonts w:ascii="Times New Roman" w:eastAsia="Times New Roman" w:hAnsi="Times New Roman" w:cs="Times New Roman"/>
-          <w:kern w:val="0"/>
-          <w:sz w:val="24"/>
-          <w:szCs w:val="24"/>
-          <w14:ligatures w14:val="none"/>
+          <ns2:ligatures ns2:val="none"/>
+        </w:rPr>
+        <w:t>TPP Secure terms</w:t>
+      </w:r>
+      <w:r>
+        <w:rPr>
+          <w:rFonts w:ascii="Times New Roman" w:eastAsia="Times New Roman" w:hAnsi="Times New Roman" w:cs="Times New Roman"/>
+          <w:b/>
+          <w:bCs/>
+          <w:kern w:val="0"/>
+          <w:sz w:val="24"/>
+          <w:szCs w:val="24"/>
+          <ns2:ligatures ns2:val="none"/>
+        </w:rPr>
+        <w:t xml:space="preserve">:</w:t>
+      </w:r>
+      <w:r>
+        <w:rPr>
+          <w:rFonts w:ascii="Times New Roman" w:eastAsia="Times New Roman" w:hAnsi="Times New Roman" w:cs="Times New Roman"/>
+          <w:kern w:val="0"/>
+          <w:sz w:val="24"/>
+          <w:szCs w:val="24"/>
+          <ns2:ligatures ns2:val="none"/>
         </w:rPr>
         <w:t xml:space="preserve"> </w:t>
       </w:r>
@@ -2038,22 +2038,22 @@
           <w:kern w:val="0"/>
           <w:sz w:val="24"/>
           <w:szCs w:val="24"/>
-          <w14:ligatures w14:val="none"/>
-        </w:rPr>
-        <w:t>PROTEGO</w:t>
-      </w:r>
-      <w:r>
-        <w:rPr>
-          <w:rFonts w:ascii="Times New Roman" w:eastAsia="Times New Roman" w:hAnsi="Times New Roman" w:cs="Times New Roman"/>
-          <w:kern w:val="0"/>
-          <w:sz w:val="24"/>
-          <w:szCs w:val="24"/>
-          <w14:ligatures w14:val="none"/>
-        </w:rPr>
-        <w:t>TermsConditions.com</w:t>
-      </w:r>
-    </w:p>
-    <w:p>
+          <ns2:ligatures ns2:val="none"/>
+        </w:rPr>
+        <w:t>TPPTermsAndConditions.com</w:t>
+      </w:r>
+      <w:r>
+        <w:rPr>
+          <w:rFonts w:ascii="Times New Roman" w:eastAsia="Times New Roman" w:hAnsi="Times New Roman" w:cs="Times New Roman"/>
+          <w:kern w:val="0"/>
+          <w:sz w:val="24"/>
+          <w:szCs w:val="24"/>
+          <ns2:ligatures ns2:val="none"/>
+        </w:rPr>
+        <w:t/>
+      </w:r>
+    </w:p>
+    <w:p ns2:paraId="1CC8B846" ns2:textId="77777777">
       <w:pPr>
         <w:numPr>
           <w:ilvl w:val="0"/>
@@ -2065,18 +2065,18 @@
           <w:kern w:val="0"/>
           <w:sz w:val="24"/>
           <w:szCs w:val="24"/>
-          <w14:ligatures w14:val="none"/>
-        </w:rPr>
-      </w:pPr>
-      <w:r>
-        <w:rPr>
-          <w:rFonts w:ascii="Times New Roman" w:eastAsia="Times New Roman" w:hAnsi="Times New Roman" w:cs="Times New Roman"/>
-          <w:b/>
-          <w:bCs/>
-          <w:kern w:val="0"/>
-          <w:sz w:val="24"/>
-          <w:szCs w:val="24"/>
-          <w14:ligatures w14:val="none"/>
+          <ns2:ligatures ns2:val="none"/>
+        </w:rPr>
+      </w:pPr>
+      <w:r>
+        <w:rPr>
+          <w:rFonts w:ascii="Times New Roman" w:eastAsia="Times New Roman" w:hAnsi="Times New Roman" w:cs="Times New Roman"/>
+          <w:b/>
+          <w:bCs/>
+          <w:kern w:val="0"/>
+          <w:sz w:val="24"/>
+          <w:szCs w:val="24"/>
+          <ns2:ligatures ns2:val="none"/>
         </w:rPr>
         <w:t>Response time:</w:t>
       </w:r>
@@ -2086,52 +2086,52 @@
           <w:kern w:val="0"/>
           <w:sz w:val="24"/>
           <w:szCs w:val="24"/>
-          <w14:ligatures w14:val="none"/>
+          <ns2:ligatures ns2:val="none"/>
         </w:rPr>
         <w:t xml:space="preserve"> Within one business day</w:t>
       </w:r>
     </w:p>
-    <w:p>
-      <w:pPr>
-        <w:rPr>
-          <w:rFonts w:ascii="Times New Roman" w:eastAsia="Times New Roman" w:hAnsi="Times New Roman" w:cs="Times New Roman"/>
-          <w:kern w:val="0"/>
-          <w:sz w:val="24"/>
-          <w:szCs w:val="24"/>
-          <w14:ligatures w14:val="none"/>
-        </w:rPr>
-      </w:pPr>
-      <w:r>
-        <w:rPr>
-          <w:rFonts w:ascii="Times New Roman" w:eastAsia="Times New Roman" w:hAnsi="Times New Roman" w:cs="Times New Roman"/>
-          <w:kern w:val="0"/>
-          <w:sz w:val="24"/>
-          <w:szCs w:val="24"/>
-          <w14:ligatures w14:val="none"/>
-        </w:rPr>
-        <w:pict w14:anchorId="603209EA">
-          <v:rect id="_x0000_i1031" style="width:0;height:1.5pt" o:hralign="center" o:hrstd="t" o:hr="t" fillcolor="#a0a0a0" stroked="f"/>
+    <w:p ns2:paraId="5B5211E5" ns2:textId="77777777">
+      <w:pPr>
+        <w:rPr>
+          <w:rFonts w:ascii="Times New Roman" w:eastAsia="Times New Roman" w:hAnsi="Times New Roman" w:cs="Times New Roman"/>
+          <w:kern w:val="0"/>
+          <w:sz w:val="24"/>
+          <w:szCs w:val="24"/>
+          <ns2:ligatures ns2:val="none"/>
+        </w:rPr>
+      </w:pPr>
+      <w:r>
+        <w:rPr>
+          <w:rFonts w:ascii="Times New Roman" w:eastAsia="Times New Roman" w:hAnsi="Times New Roman" w:cs="Times New Roman"/>
+          <w:kern w:val="0"/>
+          <w:sz w:val="24"/>
+          <w:szCs w:val="24"/>
+          <ns2:ligatures ns2:val="none"/>
+        </w:rPr>
+        <w:pict ns2:anchorId="603209EA">
+          <ns3:rect id="_x0000_i1031" style="width:0;height:1.5pt" ns4:hralign="center" ns4:hrstd="t" ns4:hr="t" fillcolor="#a0a0a0" stroked="f"/>
         </w:pict>
       </w:r>
     </w:p>
-    <w:p>
-      <w:pPr>
-        <w:spacing w:before="100" w:beforeAutospacing="1" w:after="100" w:afterAutospacing="1"/>
-        <w:rPr>
-          <w:rFonts w:ascii="Times New Roman" w:eastAsia="Times New Roman" w:hAnsi="Times New Roman" w:cs="Times New Roman"/>
-          <w:kern w:val="0"/>
-          <w:sz w:val="24"/>
-          <w:szCs w:val="24"/>
-          <w14:ligatures w14:val="none"/>
-        </w:rPr>
-      </w:pPr>
-      <w:r>
-        <w:rPr>
-          <w:rFonts w:ascii="Times New Roman" w:eastAsia="Times New Roman" w:hAnsi="Times New Roman" w:cs="Times New Roman"/>
-          <w:kern w:val="0"/>
-          <w:sz w:val="24"/>
-          <w:szCs w:val="24"/>
-          <w14:ligatures w14:val="none"/>
+    <w:p ns2:paraId="76856E6E" ns2:textId="3B7DC840">
+      <w:pPr>
+        <w:spacing w:before="100" w:beforeAutospacing="1" w:after="100" w:afterAutospacing="1"/>
+        <w:rPr>
+          <w:rFonts w:ascii="Times New Roman" w:eastAsia="Times New Roman" w:hAnsi="Times New Roman" w:cs="Times New Roman"/>
+          <w:kern w:val="0"/>
+          <w:sz w:val="24"/>
+          <w:szCs w:val="24"/>
+          <ns2:ligatures ns2:val="none"/>
+        </w:rPr>
+      </w:pPr>
+      <w:r>
+        <w:rPr>
+          <w:rFonts w:ascii="Times New Roman" w:eastAsia="Times New Roman" w:hAnsi="Times New Roman" w:cs="Times New Roman"/>
+          <w:kern w:val="0"/>
+          <w:sz w:val="24"/>
+          <w:szCs w:val="24"/>
+          <ns2:ligatures ns2:val="none"/>
         </w:rPr>
         <w:t xml:space="preserve">Your insurance renewal deadline is an opportunity to make sure you have the right protection at the right price. Whether you choose </w:t>
       </w:r>
@@ -2141,61 +2141,61 @@
           <w:kern w:val="0"/>
           <w:sz w:val="24"/>
           <w:szCs w:val="24"/>
-          <w14:ligatures w14:val="none"/>
-        </w:rPr>
-        <w:t>PROTEGO</w:t>
-      </w:r>
-      <w:r>
-        <w:rPr>
-          <w:rFonts w:ascii="Times New Roman" w:eastAsia="Times New Roman" w:hAnsi="Times New Roman" w:cs="Times New Roman"/>
-          <w:kern w:val="0"/>
-          <w:sz w:val="24"/>
-          <w:szCs w:val="24"/>
-          <w14:ligatures w14:val="none"/>
-        </w:rPr>
-        <w:t xml:space="preserve"> Protection or renew your existing coverage, we're here to help you stay protected without interruption.</w:t>
-      </w:r>
-    </w:p>
-    <w:p>
-      <w:pPr>
-        <w:spacing w:before="100" w:beforeAutospacing="1" w:after="100" w:afterAutospacing="1"/>
-        <w:rPr>
-          <w:rFonts w:ascii="Times New Roman" w:eastAsia="Times New Roman" w:hAnsi="Times New Roman" w:cs="Times New Roman"/>
-          <w:kern w:val="0"/>
-          <w:sz w:val="24"/>
-          <w:szCs w:val="24"/>
-          <w14:ligatures w14:val="none"/>
-        </w:rPr>
-      </w:pPr>
-      <w:r>
-        <w:rPr>
-          <w:rFonts w:ascii="Times New Roman" w:eastAsia="Times New Roman" w:hAnsi="Times New Roman" w:cs="Times New Roman"/>
-          <w:kern w:val="0"/>
-          <w:sz w:val="24"/>
-          <w:szCs w:val="24"/>
-          <w14:ligatures w14:val="none"/>
+          <ns2:ligatures ns2:val="none"/>
+        </w:rPr>
+        <w:t>TPP Secure Protection</w:t>
+      </w:r>
+      <w:r>
+        <w:rPr>
+          <w:rFonts w:ascii="Times New Roman" w:eastAsia="Times New Roman" w:hAnsi="Times New Roman" w:cs="Times New Roman"/>
+          <w:kern w:val="0"/>
+          <w:sz w:val="24"/>
+          <w:szCs w:val="24"/>
+          <ns2:ligatures ns2:val="none"/>
+        </w:rPr>
+        <w:t xml:space="preserve"> or renew your existing coverage, we're here to help you stay protected without interruption.</w:t>
+      </w:r>
+    </w:p>
+    <w:p ns2:paraId="77EA75E8" ns2:textId="77777777">
+      <w:pPr>
+        <w:spacing w:before="100" w:beforeAutospacing="1" w:after="100" w:afterAutospacing="1"/>
+        <w:rPr>
+          <w:rFonts w:ascii="Times New Roman" w:eastAsia="Times New Roman" w:hAnsi="Times New Roman" w:cs="Times New Roman"/>
+          <w:kern w:val="0"/>
+          <w:sz w:val="24"/>
+          <w:szCs w:val="24"/>
+          <ns2:ligatures ns2:val="none"/>
+        </w:rPr>
+      </w:pPr>
+      <w:r>
+        <w:rPr>
+          <w:rFonts w:ascii="Times New Roman" w:eastAsia="Times New Roman" w:hAnsi="Times New Roman" w:cs="Times New Roman"/>
+          <w:kern w:val="0"/>
+          <w:sz w:val="24"/>
+          <w:szCs w:val="24"/>
+          <ns2:ligatures ns2:val="none"/>
         </w:rPr>
         <w:t>Thank you for being a valued [Facility Name] tenant.</w:t>
       </w:r>
     </w:p>
-    <w:p>
-      <w:pPr>
-        <w:spacing w:before="100" w:beforeAutospacing="1" w:after="100" w:afterAutospacing="1"/>
-        <w:rPr>
-          <w:rFonts w:ascii="Times New Roman" w:eastAsia="Times New Roman" w:hAnsi="Times New Roman" w:cs="Times New Roman"/>
-          <w:kern w:val="0"/>
-          <w:sz w:val="24"/>
-          <w:szCs w:val="24"/>
-          <w14:ligatures w14:val="none"/>
-        </w:rPr>
-      </w:pPr>
-      <w:r>
-        <w:rPr>
-          <w:rFonts w:ascii="Times New Roman" w:eastAsia="Times New Roman" w:hAnsi="Times New Roman" w:cs="Times New Roman"/>
-          <w:kern w:val="0"/>
-          <w:sz w:val="24"/>
-          <w:szCs w:val="24"/>
-          <w14:ligatures w14:val="none"/>
+    <w:p ns2:paraId="78BA4089" ns2:textId="77777777">
+      <w:pPr>
+        <w:spacing w:before="100" w:beforeAutospacing="1" w:after="100" w:afterAutospacing="1"/>
+        <w:rPr>
+          <w:rFonts w:ascii="Times New Roman" w:eastAsia="Times New Roman" w:hAnsi="Times New Roman" w:cs="Times New Roman"/>
+          <w:kern w:val="0"/>
+          <w:sz w:val="24"/>
+          <w:szCs w:val="24"/>
+          <ns2:ligatures ns2:val="none"/>
+        </w:rPr>
+      </w:pPr>
+      <w:r>
+        <w:rPr>
+          <w:rFonts w:ascii="Times New Roman" w:eastAsia="Times New Roman" w:hAnsi="Times New Roman" w:cs="Times New Roman"/>
+          <w:kern w:val="0"/>
+          <w:sz w:val="24"/>
+          <w:szCs w:val="24"/>
+          <ns2:ligatures ns2:val="none"/>
         </w:rPr>
         <w:t>Sincerely,</w:t>
       </w:r>
@@ -2205,44 +2205,44 @@
           <w:kern w:val="0"/>
           <w:sz w:val="24"/>
           <w:szCs w:val="24"/>
-          <w14:ligatures w14:val="none"/>
+          <ns2:ligatures ns2:val="none"/>
         </w:rPr>
         <w:br/>
         <w:t>[Facility Name] Management</w:t>
       </w:r>
     </w:p>
-    <w:p>
-      <w:pPr>
-        <w:rPr>
-          <w:rFonts w:ascii="Times New Roman" w:eastAsia="Times New Roman" w:hAnsi="Times New Roman" w:cs="Times New Roman"/>
-          <w:kern w:val="0"/>
-          <w:sz w:val="24"/>
-          <w:szCs w:val="24"/>
-          <w14:ligatures w14:val="none"/>
-        </w:rPr>
-      </w:pPr>
-      <w:r>
-        <w:rPr>
-          <w:rFonts w:ascii="Times New Roman" w:eastAsia="Times New Roman" w:hAnsi="Times New Roman" w:cs="Times New Roman"/>
-          <w:kern w:val="0"/>
-          <w:sz w:val="24"/>
-          <w:szCs w:val="24"/>
-          <w14:ligatures w14:val="none"/>
-        </w:rPr>
-        <w:pict w14:anchorId="7AB34B6B">
-          <v:rect id="_x0000_i1032" style="width:0;height:1.5pt" o:hralign="center" o:hrstd="t" o:hr="t" fillcolor="#a0a0a0" stroked="f"/>
+    <w:p ns2:paraId="1C4AC055" ns2:textId="77777777">
+      <w:pPr>
+        <w:rPr>
+          <w:rFonts w:ascii="Times New Roman" w:eastAsia="Times New Roman" w:hAnsi="Times New Roman" w:cs="Times New Roman"/>
+          <w:kern w:val="0"/>
+          <w:sz w:val="24"/>
+          <w:szCs w:val="24"/>
+          <ns2:ligatures ns2:val="none"/>
+        </w:rPr>
+      </w:pPr>
+      <w:r>
+        <w:rPr>
+          <w:rFonts w:ascii="Times New Roman" w:eastAsia="Times New Roman" w:hAnsi="Times New Roman" w:cs="Times New Roman"/>
+          <w:kern w:val="0"/>
+          <w:sz w:val="24"/>
+          <w:szCs w:val="24"/>
+          <ns2:ligatures ns2:val="none"/>
+        </w:rPr>
+        <w:pict ns2:anchorId="7AB34B6B">
+          <ns3:rect id="_x0000_i1032" style="width:0;height:1.5pt" ns4:hralign="center" ns4:hrstd="t" ns4:hr="t" fillcolor="#a0a0a0" stroked="f"/>
         </w:pict>
       </w:r>
     </w:p>
-    <w:p>
-      <w:pPr>
-        <w:spacing w:before="100" w:beforeAutospacing="1" w:after="100" w:afterAutospacing="1"/>
-        <w:rPr>
-          <w:rFonts w:ascii="Times New Roman" w:eastAsia="Times New Roman" w:hAnsi="Times New Roman" w:cs="Times New Roman"/>
-          <w:kern w:val="0"/>
-          <w:sz w:val="24"/>
-          <w:szCs w:val="24"/>
-          <w14:ligatures w14:val="none"/>
+    <w:p ns2:paraId="7AC13A64" ns2:textId="0F22B328">
+      <w:pPr>
+        <w:spacing w:before="100" w:beforeAutospacing="1" w:after="100" w:afterAutospacing="1"/>
+        <w:rPr>
+          <w:rFonts w:ascii="Times New Roman" w:eastAsia="Times New Roman" w:hAnsi="Times New Roman" w:cs="Times New Roman"/>
+          <w:kern w:val="0"/>
+          <w:sz w:val="24"/>
+          <w:szCs w:val="24"/>
+          <ns2:ligatures ns2:val="none"/>
         </w:rPr>
       </w:pPr>
       <w:proofErr w:type="gramStart"/>
@@ -2254,7 +2254,7 @@
           <w:kern w:val="0"/>
           <w:sz w:val="24"/>
           <w:szCs w:val="24"/>
-          <w14:ligatures w14:val="none"/>
+          <ns2:ligatures ns2:val="none"/>
         </w:rPr>
         <w:t>P.S.</w:t>
       </w:r>
@@ -2265,7 +2265,7 @@
           <w:kern w:val="0"/>
           <w:sz w:val="24"/>
           <w:szCs w:val="24"/>
-          <w14:ligatures w14:val="none"/>
+          <ns2:ligatures ns2:val="none"/>
         </w:rPr>
         <w:t xml:space="preserve"> Don't wait until the last minute. Act now to either switch to </w:t>
       </w:r>
@@ -2275,22 +2275,22 @@
           <w:kern w:val="0"/>
           <w:sz w:val="24"/>
           <w:szCs w:val="24"/>
-          <w14:ligatures w14:val="none"/>
-        </w:rPr>
-        <w:t>PROTEGO</w:t>
-      </w:r>
-      <w:r>
-        <w:rPr>
-          <w:rFonts w:ascii="Times New Roman" w:eastAsia="Times New Roman" w:hAnsi="Times New Roman" w:cs="Times New Roman"/>
-          <w:kern w:val="0"/>
-          <w:sz w:val="24"/>
-          <w:szCs w:val="24"/>
-          <w14:ligatures w14:val="none"/>
-        </w:rPr>
-        <w:t xml:space="preserve"> Protection or update your insurance documentation. Your 10-day deadline is approaching, and we want to ensure zero gap in your coverage.</w:t>
-      </w:r>
-    </w:p>
-    <w:p/>
+          <ns2:ligatures ns2:val="none"/>
+        </w:rPr>
+        <w:t>TPP Secure Protection</w:t>
+      </w:r>
+      <w:r>
+        <w:rPr>
+          <w:rFonts w:ascii="Times New Roman" w:eastAsia="Times New Roman" w:hAnsi="Times New Roman" w:cs="Times New Roman"/>
+          <w:kern w:val="0"/>
+          <w:sz w:val="24"/>
+          <w:szCs w:val="24"/>
+          <ns2:ligatures ns2:val="none"/>
+        </w:rPr>
+        <w:t xml:space="preserve"> or update your insurance documentation. Your 10-day deadline is approaching, and we want to ensure zero gap in your coverage.</w:t>
+      </w:r>
+    </w:p>
+    <w:p ns2:paraId="6E725571" ns2:textId="393A7144"/>
     <w:sectPr>
       <w:pgSz w:w="12240" w:h="15840"/>
       <w:pgMar w:top="1440" w:right="1440" w:bottom="1440" w:left="1440" w:header="720" w:footer="720" w:gutter="0"/>

</xml_diff>